<commit_message>
Improve ATS resume and Vercel build output
</commit_message>
<xml_diff>
--- a/output/docx/Chandra_Aditiya_Putra_CV_Magang_ATS.docx
+++ b/output/docx/Chandra_Aditiya_Putra_CV_Magang_ATS.docx
@@ -4,488 +4,530 @@
   <w:body>
     <w:p>
       <w:pPr>
+        <w:spacing w:before="0" w:after="20" w:line="240" w:lineRule="auto"/>
         <w:jc w:val="center"/>
       </w:pPr>
       <w:r>
         <w:rPr>
           <w:rFonts w:ascii="Arial" w:hAnsi="Arial" w:eastAsia="Arial"/>
           <w:b/>
-          <w:color w:val="000000"/>
-          <w:sz w:val="36"/>
+          <w:color w:val="111111"/>
+          <w:sz w:val="40"/>
         </w:rPr>
         <w:t>Chandra Aditiya Putra</w:t>
       </w:r>
     </w:p>
     <w:p>
       <w:pPr>
+        <w:spacing w:before="0" w:after="40" w:line="240" w:lineRule="auto"/>
         <w:jc w:val="center"/>
       </w:pPr>
       <w:r>
         <w:rPr>
           <w:rFonts w:ascii="Arial" w:hAnsi="Arial" w:eastAsia="Arial"/>
-          <w:color w:val="000000"/>
-          <w:sz w:val="17"/>
+          <w:b/>
+          <w:color w:val="111111"/>
+          <w:sz w:val="22"/>
         </w:rPr>
-        <w:t>(+62) 857-1029-7624  |  chandraaditiyaputra80@gmail.com  |  Karawang  |  github.com/chandra7251</w:t>
+        <w:t>Fullstack Developer | Backend-Focused</w:t>
       </w:r>
     </w:p>
     <w:p>
       <w:pPr>
-        <w:pStyle w:val="Heading1"/>
+        <w:spacing w:before="0" w:after="80" w:line="252" w:lineRule="auto"/>
+        <w:jc w:val="center"/>
       </w:pPr>
       <w:r>
         <w:rPr>
           <w:rFonts w:ascii="Arial" w:hAnsi="Arial" w:eastAsia="Arial"/>
-          <w:color w:val="000000"/>
+          <w:b w:val="0"/>
+          <w:color w:val="111111"/>
+          <w:sz w:val="17"/>
         </w:rPr>
-        <w:t>Professional Summary</w:t>
-      </w:r>
-    </w:p>
-    <w:p>
-      <w:pPr/>
-      <w:r>
-        <w:rPr>
-          <w:rFonts w:ascii="Arial" w:hAnsi="Arial" w:eastAsia="Arial"/>
-          <w:color w:val="000000"/>
-        </w:rPr>
-        <w:t>Mahasiswa semester 5 Teknik Informatika dengan IPK 3.77 yang sedang mencari kesempatan magang di bidang web development, mobile development, atau backend development. Pernah mengerjakan project menggunakan Laravel, PHP, Ionic, Next.js, React, TypeScript, MySQL, PostgreSQL, Prisma, Supabase, REST API, dan Figma. Tertarik membangun aplikasi, mempelajari teknologi baru, serta berkontribusi dalam tim engineering.</w:t>
+        <w:t>Karawang, Indonesia  |  chandraaditiyaputra80@gmail.com  |  portfolio-chandra.vercel.app</w:t>
       </w:r>
     </w:p>
     <w:p>
       <w:pPr>
-        <w:pStyle w:val="Heading1"/>
+        <w:spacing w:before="0" w:after="20" w:line="252" w:lineRule="auto"/>
+        <w:jc w:val="center"/>
       </w:pPr>
       <w:r>
         <w:rPr>
           <w:rFonts w:ascii="Arial" w:hAnsi="Arial" w:eastAsia="Arial"/>
-          <w:color w:val="000000"/>
+          <w:b w:val="0"/>
+          <w:color w:val="111111"/>
+          <w:sz w:val="17"/>
         </w:rPr>
-        <w:t>Pendidikan</w:t>
-      </w:r>
-    </w:p>
-    <w:p>
-      <w:pPr/>
-      <w:r>
-        <w:rPr>
-          <w:rFonts w:ascii="Arial" w:hAnsi="Arial" w:eastAsia="Arial"/>
-          <w:color w:val="000000"/>
-        </w:rPr>
-        <w:t>2024 - Sekarang | Universitas Buana Perjuangan Karawang | Program Studi Teknik Informatika | Semester 5 | IPK 3.77</w:t>
-      </w:r>
-    </w:p>
-    <w:p>
-      <w:pPr/>
-      <w:r>
-        <w:rPr>
-          <w:rFonts w:ascii="Arial" w:hAnsi="Arial" w:eastAsia="Arial"/>
-          <w:color w:val="000000"/>
-        </w:rPr>
-        <w:t>2020 - 2023 | SMKN 1 Rengasdengklok | Teknik Mekanik Industri (TMI)</w:t>
+        <w:t>github.com/chandra7251  |  linkedin.com/in/chandra-aditiya-putra-189249385</w:t>
       </w:r>
     </w:p>
     <w:p>
       <w:pPr>
-        <w:pStyle w:val="Heading1"/>
+        <w:spacing w:before="100" w:after="60" w:line="240" w:lineRule="auto"/>
+        <w:pBdr>
+          <w:bottom w:val="single" w:sz="6" w:space="2" w:color="000000"/>
+        </w:pBdr>
       </w:pPr>
       <w:r>
         <w:rPr>
           <w:rFonts w:ascii="Arial" w:hAnsi="Arial" w:eastAsia="Arial"/>
-          <w:color w:val="000000"/>
+          <w:b/>
+          <w:color w:val="111111"/>
+          <w:sz w:val="21"/>
         </w:rPr>
-        <w:t>Projects and Portfolio</w:t>
+        <w:t>PROFESSIONAL SUMMARY</w:t>
       </w:r>
     </w:p>
     <w:p>
       <w:pPr>
-        <w:pStyle w:val="Heading2"/>
+        <w:spacing w:before="0" w:after="20" w:line="252" w:lineRule="auto"/>
       </w:pPr>
       <w:r>
         <w:rPr>
           <w:rFonts w:ascii="Arial" w:hAnsi="Arial" w:eastAsia="Arial"/>
-          <w:color w:val="000000"/>
+          <w:b w:val="0"/>
+          <w:color w:val="111111"/>
+          <w:sz w:val="19"/>
         </w:rPr>
-        <w:t>VisuaLearn - UX Design Project | GEMASTIK XIX 2026</w:t>
-      </w:r>
-    </w:p>
-    <w:p>
-      <w:pPr/>
-      <w:r>
-        <w:rPr>
-          <w:rFonts w:ascii="Arial" w:hAnsi="Arial" w:eastAsia="Arial"/>
-          <w:color w:val="000000"/>
-        </w:rPr>
-        <w:t>- Ketua tim dan UX Designer untuk rancangan akses informasi perkuliahan bagi mahasiswa Tuli melalui transkripsi real-time dan ringkasan AI yang dapat diverifikasi.</w:t>
-      </w:r>
-    </w:p>
-    <w:p>
-      <w:pPr/>
-      <w:r>
-        <w:rPr>
-          <w:rFonts w:ascii="Arial" w:hAnsi="Arial" w:eastAsia="Arial"/>
-          <w:color w:val="000000"/>
-        </w:rPr>
-        <w:t>- Mengerjakan wawancara eksploratif, problem statement, user journey, co-design, prototipe high-fidelity, dan dua iterasi usability testing menggunakan Figma dan FigJam.</w:t>
+        <w:t>Informatics Engineering student with a 3.77 GPA and hands-on experience building web, mobile, and API products. Strongest contribution in Laravel/PHP backend development, MySQL data modeling, REST APIs, JWT authentication, and deployment. Comfortable delivering product interfaces with React, Next.js, Ionic, and Tailwind CSS. Seeking a full-stack or backend engineering internship.</w:t>
       </w:r>
     </w:p>
     <w:p>
       <w:pPr>
-        <w:pStyle w:val="Heading2"/>
+        <w:spacing w:before="100" w:after="60" w:line="240" w:lineRule="auto"/>
+        <w:pBdr>
+          <w:bottom w:val="single" w:sz="6" w:space="2" w:color="000000"/>
+        </w:pBdr>
       </w:pPr>
       <w:r>
         <w:rPr>
           <w:rFonts w:ascii="Arial" w:hAnsi="Arial" w:eastAsia="Arial"/>
-          <w:color w:val="000000"/>
+          <w:b/>
+          <w:color w:val="111111"/>
+          <w:sz w:val="21"/>
         </w:rPr>
-        <w:t>KopiKarawang - Full-Stack Web Project</w:t>
-      </w:r>
-    </w:p>
-    <w:p>
-      <w:pPr/>
-      <w:r>
-        <w:rPr>
-          <w:rFonts w:ascii="Arial" w:hAnsi="Arial" w:eastAsia="Arial"/>
-          <w:color w:val="000000"/>
-        </w:rPr>
-        <w:t>- Mengerjakan aplikasi direktori cafe dan coffeeshop Karawang menggunakan Next.js, TypeScript, PostgreSQL, Prisma, Supabase, dan Vercel.</w:t>
-      </w:r>
-    </w:p>
-    <w:p>
-      <w:pPr/>
-      <w:r>
-        <w:rPr>
-          <w:rFonts w:ascii="Arial" w:hAnsi="Arial" w:eastAsia="Arial"/>
-          <w:color w:val="000000"/>
-        </w:rPr>
-        <w:t>- Mengerjakan fitur login Google dan Discord, bookmark, review, rating, filter, Google Maps, API routes, dan admin dashboard.</w:t>
-      </w:r>
-    </w:p>
-    <w:p>
-      <w:pPr/>
-      <w:r>
-        <w:rPr>
-          <w:rFonts w:ascii="Arial" w:hAnsi="Arial" w:eastAsia="Arial"/>
-          <w:color w:val="000000"/>
-        </w:rPr>
-        <w:t>- Portfolio: https://kopikarawang.vercel.app | Repository: https://github.com/chandra7251/coffe_karawang</w:t>
+        <w:t>TECHNICAL SKILLS</w:t>
       </w:r>
     </w:p>
     <w:p>
       <w:pPr>
-        <w:pStyle w:val="Heading2"/>
+        <w:spacing w:before="0" w:after="10" w:line="240" w:lineRule="auto"/>
       </w:pPr>
       <w:r>
         <w:rPr>
           <w:rFonts w:ascii="Arial" w:hAnsi="Arial" w:eastAsia="Arial"/>
-          <w:color w:val="000000"/>
+          <w:b/>
+          <w:color w:val="111111"/>
+          <w:sz w:val="19"/>
         </w:rPr>
-        <w:t>Casher and Owner - Full-Stack Web Project</w:t>
+        <w:t xml:space="preserve">Backend &amp; Data: </w:t>
       </w:r>
-    </w:p>
-    <w:p>
-      <w:pPr/>
       <w:r>
         <w:rPr>
           <w:rFonts w:ascii="Arial" w:hAnsi="Arial" w:eastAsia="Arial"/>
-          <w:color w:val="000000"/>
+          <w:b w:val="0"/>
+          <w:color w:val="111111"/>
+          <w:sz w:val="19"/>
         </w:rPr>
-        <w:t>- Mengembangkan sistem POS cafe untuk kasir dan owner menggunakan Laravel, Inertia, React, dan MySQL.</w:t>
-      </w:r>
-    </w:p>
-    <w:p>
-      <w:pPr/>
-      <w:r>
-        <w:rPr>
-          <w:rFonts w:ascii="Arial" w:hAnsi="Arial" w:eastAsia="Arial"/>
-          <w:color w:val="000000"/>
-        </w:rPr>
-        <w:t>- Mengerjakan alur transaksi, monitoring penjualan, dan dashboard operasional.</w:t>
+        <w:t>Laravel, PHP, MySQL, PostgreSQL, REST API, JWT Authentication, Prisma, Filament</w:t>
       </w:r>
     </w:p>
     <w:p>
       <w:pPr>
-        <w:pStyle w:val="Heading2"/>
+        <w:spacing w:before="0" w:after="10" w:line="240" w:lineRule="auto"/>
       </w:pPr>
       <w:r>
         <w:rPr>
           <w:rFonts w:ascii="Arial" w:hAnsi="Arial" w:eastAsia="Arial"/>
-          <w:color w:val="000000"/>
+          <w:b/>
+          <w:color w:val="111111"/>
+          <w:sz w:val="19"/>
         </w:rPr>
-        <w:t>KeuanganKu - Personal Finance Web Project</w:t>
+        <w:t xml:space="preserve">Frontend &amp; Mobile: </w:t>
       </w:r>
-    </w:p>
-    <w:p>
-      <w:pPr/>
       <w:r>
         <w:rPr>
           <w:rFonts w:ascii="Arial" w:hAnsi="Arial" w:eastAsia="Arial"/>
-          <w:color w:val="000000"/>
+          <w:b w:val="0"/>
+          <w:color w:val="111111"/>
+          <w:sz w:val="19"/>
         </w:rPr>
-        <w:t>- Membuat aplikasi pencatatan keuangan mahasiswa menggunakan Laravel dan MySQL.</w:t>
-      </w:r>
-    </w:p>
-    <w:p>
-      <w:pPr/>
-      <w:r>
-        <w:rPr>
-          <w:rFonts w:ascii="Arial" w:hAnsi="Arial" w:eastAsia="Arial"/>
-          <w:color w:val="000000"/>
-        </w:rPr>
-        <w:t>- Mencakup monitoring orang tua, transfer, analytics, reminder, Chart.js, PHPMailer, dan export laporan.</w:t>
-      </w:r>
-    </w:p>
-    <w:p>
-      <w:pPr/>
-      <w:r>
-        <w:rPr>
-          <w:rFonts w:ascii="Arial" w:hAnsi="Arial" w:eastAsia="Arial"/>
-          <w:color w:val="000000"/>
-        </w:rPr>
-        <w:t>- Repository: https://github.com/chandra7251/kelompok-15</w:t>
+        <w:t>React, Next.js, JavaScript, TypeScript, Ionic, Blade, Tailwind CSS</w:t>
       </w:r>
     </w:p>
     <w:p>
       <w:pPr>
-        <w:pStyle w:val="Heading2"/>
+        <w:spacing w:before="0" w:after="10" w:line="240" w:lineRule="auto"/>
       </w:pPr>
       <w:r>
         <w:rPr>
           <w:rFonts w:ascii="Arial" w:hAnsi="Arial" w:eastAsia="Arial"/>
-          <w:color w:val="000000"/>
+          <w:b/>
+          <w:color w:val="111111"/>
+          <w:sz w:val="19"/>
         </w:rPr>
-        <w:t>ZETA E-Procurement - Web Project</w:t>
+        <w:t xml:space="preserve">Workflow &amp; Deployment: </w:t>
       </w:r>
-    </w:p>
-    <w:p>
-      <w:pPr/>
       <w:r>
         <w:rPr>
           <w:rFonts w:ascii="Arial" w:hAnsi="Arial" w:eastAsia="Arial"/>
-          <w:color w:val="000000"/>
+          <w:b w:val="0"/>
+          <w:color w:val="111111"/>
+          <w:sz w:val="19"/>
         </w:rPr>
-        <w:t>- Berkontribusi pada project sistem pengadaan barang dan jasa menggunakan Laravel, PHP, Blade, JavaScript, CSS, REST API, dan JWT Authentication.</w:t>
-      </w:r>
-    </w:p>
-    <w:p>
-      <w:pPr/>
-      <w:r>
-        <w:rPr>
-          <w:rFonts w:ascii="Arial" w:hAnsi="Arial" w:eastAsia="Arial"/>
-          <w:color w:val="000000"/>
-        </w:rPr>
-        <w:t>- Mengerjakan fitur vendor, tender, bidding, kontrak digital, audit log, export dokumen, dan notifikasi.</w:t>
-      </w:r>
-    </w:p>
-    <w:p>
-      <w:pPr/>
-      <w:r>
-        <w:rPr>
-          <w:rFonts w:ascii="Arial" w:hAnsi="Arial" w:eastAsia="Arial"/>
-          <w:color w:val="000000"/>
-        </w:rPr>
-        <w:t>- Repository: https://github.com/chandra7251/e-tender</w:t>
+        <w:t>Node.js, Git, GitHub, Vercel</w:t>
       </w:r>
     </w:p>
     <w:p>
       <w:pPr>
-        <w:pStyle w:val="Heading2"/>
+        <w:spacing w:before="100" w:after="60" w:line="240" w:lineRule="auto"/>
+        <w:pBdr>
+          <w:bottom w:val="single" w:sz="6" w:space="2" w:color="000000"/>
+        </w:pBdr>
       </w:pPr>
       <w:r>
         <w:rPr>
           <w:rFonts w:ascii="Arial" w:hAnsi="Arial" w:eastAsia="Arial"/>
-          <w:color w:val="000000"/>
+          <w:b/>
+          <w:color w:val="111111"/>
+          <w:sz w:val="21"/>
         </w:rPr>
-        <w:t>Mobile E-Tender and E-Procurement API - Mobile and Backend Project</w:t>
-      </w:r>
-    </w:p>
-    <w:p>
-      <w:pPr/>
-      <w:r>
-        <w:rPr>
-          <w:rFonts w:ascii="Arial" w:hAnsi="Arial" w:eastAsia="Arial"/>
-          <w:color w:val="000000"/>
-        </w:rPr>
-        <w:t>- Mengerjakan aplikasi mobile pendamping e-procurement menggunakan Ionic, TypeScript, HTML, SCSS, JavaScript, dan REST API.</w:t>
-      </w:r>
-    </w:p>
-    <w:p>
-      <w:pPr/>
-      <w:r>
-        <w:rPr>
-          <w:rFonts w:ascii="Arial" w:hAnsi="Arial" w:eastAsia="Arial"/>
-          <w:color w:val="000000"/>
-        </w:rPr>
-        <w:t>- Membangun API untuk authentication, vendor, tender, bidding, hasil, dan purchase order menggunakan Laravel dan JSON.</w:t>
-      </w:r>
-    </w:p>
-    <w:p>
-      <w:pPr/>
-      <w:r>
-        <w:rPr>
-          <w:rFonts w:ascii="Arial" w:hAnsi="Arial" w:eastAsia="Arial"/>
-          <w:color w:val="000000"/>
-        </w:rPr>
-        <w:t>- Repository: https://github.com/chandra7251/mobile_e-tender | https://github.com/chandra7251/e-procurement-api</w:t>
+        <w:t>SELECTED PROJECTS</w:t>
       </w:r>
     </w:p>
     <w:p>
       <w:pPr>
-        <w:pStyle w:val="Heading1"/>
+        <w:spacing w:before="30" w:after="6" w:line="240" w:lineRule="auto"/>
       </w:pPr>
       <w:r>
         <w:rPr>
           <w:rFonts w:ascii="Arial" w:hAnsi="Arial" w:eastAsia="Arial"/>
-          <w:color w:val="000000"/>
+          <w:b/>
+          <w:color w:val="111111"/>
+          <w:sz w:val="19"/>
         </w:rPr>
-        <w:t>Pengalaman Kerja dan PKL</w:t>
-      </w:r>
-    </w:p>
-    <w:p>
-      <w:pPr/>
-      <w:r>
-        <w:rPr>
-          <w:rFonts w:ascii="Arial" w:hAnsi="Arial" w:eastAsia="Arial"/>
-          <w:color w:val="000000"/>
-        </w:rPr>
-        <w:t>Juni 2023 - Juni 2024 | Operator Produksi | PT AT Indonesia</w:t>
-      </w:r>
-    </w:p>
-    <w:p>
-      <w:pPr/>
-      <w:r>
-        <w:rPr>
-          <w:rFonts w:ascii="Arial" w:hAnsi="Arial" w:eastAsia="Arial"/>
-          <w:color w:val="000000"/>
-        </w:rPr>
-        <w:t>- Melakukan proses machining sesuai SOP dan standar kualitas perusahaan.</w:t>
-      </w:r>
-    </w:p>
-    <w:p>
-      <w:pPr/>
-      <w:r>
-        <w:rPr>
-          <w:rFonts w:ascii="Arial" w:hAnsi="Arial" w:eastAsia="Arial"/>
-          <w:color w:val="000000"/>
-        </w:rPr>
-        <w:t>- Menjaga kualitas produk, menerapkan prosedur K3, dan bekerja sama dengan tim untuk mencapai target produksi harian.</w:t>
-      </w:r>
-    </w:p>
-    <w:p>
-      <w:pPr/>
-      <w:r>
-        <w:rPr>
-          <w:rFonts w:ascii="Arial" w:hAnsi="Arial" w:eastAsia="Arial"/>
-          <w:color w:val="000000"/>
-        </w:rPr>
-        <w:t>November 2021 - Januari 2022 | Inspeksi - Praktik Kerja Lapangan | PT Marutake Miyama Indonesia</w:t>
-      </w:r>
-    </w:p>
-    <w:p>
-      <w:pPr/>
-      <w:r>
-        <w:rPr>
-          <w:rFonts w:ascii="Arial" w:hAnsi="Arial" w:eastAsia="Arial"/>
-          <w:color w:val="000000"/>
-        </w:rPr>
-        <w:t>- Memeriksa produk untuk memastikan kesesuaian dengan standar dan mengidentifikasi produk NG untuk proses repair.</w:t>
-      </w:r>
-    </w:p>
-    <w:p>
-      <w:pPr/>
-      <w:r>
-        <w:rPr>
-          <w:rFonts w:ascii="Arial" w:hAnsi="Arial" w:eastAsia="Arial"/>
-          <w:color w:val="000000"/>
-        </w:rPr>
-        <w:t>- Melakukan packing produk yang telah lolos inspeksi untuk dikirim kepada customer.</w:t>
+        <w:t>ZETA E-Procurement | Team Lead, Backend, Database, Authentication &amp; Deployment</w:t>
       </w:r>
     </w:p>
     <w:p>
       <w:pPr>
-        <w:pStyle w:val="Heading1"/>
+        <w:spacing w:before="0" w:after="5" w:line="250" w:lineRule="auto"/>
+        <w:ind w:left="144"/>
       </w:pPr>
       <w:r>
         <w:rPr>
           <w:rFonts w:ascii="Arial" w:hAnsi="Arial" w:eastAsia="Arial"/>
-          <w:color w:val="000000"/>
+          <w:b/>
+          <w:color w:val="111111"/>
+          <w:sz w:val="18"/>
         </w:rPr>
-        <w:t>Skills</w:t>
+        <w:t xml:space="preserve">- </w:t>
+      </w:r>
+      <w:r>
+        <w:rPr>
+          <w:rFonts w:ascii="Arial" w:hAnsi="Arial" w:eastAsia="Arial"/>
+          <w:b w:val="0"/>
+          <w:color w:val="111111"/>
+          <w:sz w:val="18"/>
+        </w:rPr>
+        <w:t>Led backend delivery for a five-person academic final project. Built Laravel/PHP services, MySQL data model, JWT authentication, and deployment for vendor, tender, bidding, contract, audit-log, and document workflows. Mobile app published on Google Play Store.</w:t>
       </w:r>
     </w:p>
     <w:p>
-      <w:pPr/>
+      <w:pPr>
+        <w:spacing w:before="0" w:after="8" w:line="240" w:lineRule="auto"/>
+        <w:ind w:left="144"/>
+      </w:pPr>
+      <w:r>
+        <w:rPr>
+          <w:rFonts w:ascii="Arial" w:hAnsi="Arial" w:eastAsia="Arial"/>
+          <w:b w:val="0"/>
+          <w:color w:val="333333"/>
+          <w:sz w:val="17"/>
+        </w:rPr>
+        <w:t>Laravel, PHP, MySQL, JWT, Blade, Tailwind CSS | Google Play: play.google.com/store/apps/details?id=com.vandrafcy.zeta</w:t>
+      </w:r>
+    </w:p>
+    <w:p>
+      <w:pPr>
+        <w:spacing w:before="30" w:after="6" w:line="240" w:lineRule="auto"/>
+      </w:pPr>
       <w:r>
         <w:rPr>
           <w:rFonts w:ascii="Arial" w:hAnsi="Arial" w:eastAsia="Arial"/>
           <w:b/>
-          <w:color w:val="000000"/>
+          <w:color w:val="111111"/>
+          <w:sz w:val="19"/>
         </w:rPr>
-        <w:t xml:space="preserve">Hard Skills: </w:t>
+        <w:t>Cashier &amp; Owner | Point-of-Sale Web Application</w:t>
+      </w:r>
+    </w:p>
+    <w:p>
+      <w:pPr>
+        <w:spacing w:before="0" w:after="5" w:line="250" w:lineRule="auto"/>
+        <w:ind w:left="144"/>
+      </w:pPr>
+      <w:r>
+        <w:rPr>
+          <w:rFonts w:ascii="Arial" w:hAnsi="Arial" w:eastAsia="Arial"/>
+          <w:b/>
+          <w:color w:val="111111"/>
+          <w:sz w:val="18"/>
+        </w:rPr>
+        <w:t xml:space="preserve">- </w:t>
       </w:r>
       <w:r>
         <w:rPr>
           <w:rFonts w:ascii="Arial" w:hAnsi="Arial" w:eastAsia="Arial"/>
-          <w:color w:val="000000"/>
+          <w:b w:val="0"/>
+          <w:color w:val="111111"/>
+          <w:sz w:val="18"/>
         </w:rPr>
-        <w:t>PHP, JavaScript, TypeScript, HTML, CSS, Python, Laravel, Next.js, React, Ionic, Filament, MySQL, PostgreSQL, Prisma, Supabase, REST API, JWT Authentication, Figma, FigJam, Human-Centred Design, UX research, usability testing, WCAG 2.2</w:t>
+        <w:t>Built a cafe point-of-sale workflow for cashier and owner roles, covering transactions, sales monitoring, and an operations dashboard.</w:t>
       </w:r>
     </w:p>
     <w:p>
-      <w:pPr/>
+      <w:pPr>
+        <w:spacing w:before="0" w:after="8" w:line="240" w:lineRule="auto"/>
+        <w:ind w:left="144"/>
+      </w:pPr>
+      <w:r>
+        <w:rPr>
+          <w:rFonts w:ascii="Arial" w:hAnsi="Arial" w:eastAsia="Arial"/>
+          <w:b w:val="0"/>
+          <w:color w:val="333333"/>
+          <w:sz w:val="17"/>
+        </w:rPr>
+        <w:t>Laravel, PHP, MySQL, React | GitHub: github.com/chandra7251</w:t>
+      </w:r>
+    </w:p>
+    <w:p>
+      <w:pPr>
+        <w:spacing w:before="30" w:after="6" w:line="240" w:lineRule="auto"/>
+      </w:pPr>
       <w:r>
         <w:rPr>
           <w:rFonts w:ascii="Arial" w:hAnsi="Arial" w:eastAsia="Arial"/>
           <w:b/>
-          <w:color w:val="000000"/>
+          <w:color w:val="111111"/>
+          <w:sz w:val="19"/>
         </w:rPr>
-        <w:t xml:space="preserve">Tools: </w:t>
+        <w:t>Coffee Karawang | Full-Stack Cafe Directory</w:t>
+      </w:r>
+    </w:p>
+    <w:p>
+      <w:pPr>
+        <w:spacing w:before="0" w:after="5" w:line="250" w:lineRule="auto"/>
+        <w:ind w:left="144"/>
+      </w:pPr>
+      <w:r>
+        <w:rPr>
+          <w:rFonts w:ascii="Arial" w:hAnsi="Arial" w:eastAsia="Arial"/>
+          <w:b/>
+          <w:color w:val="111111"/>
+          <w:sz w:val="18"/>
+        </w:rPr>
+        <w:t xml:space="preserve">- </w:t>
       </w:r>
       <w:r>
         <w:rPr>
           <w:rFonts w:ascii="Arial" w:hAnsi="Arial" w:eastAsia="Arial"/>
-          <w:color w:val="000000"/>
+          <w:b w:val="0"/>
+          <w:color w:val="111111"/>
+          <w:sz w:val="18"/>
         </w:rPr>
-        <w:t>Git, GitHub, Visual Studio Code, Microsoft Office, Vercel</w:t>
+        <w:t>Built a cafe and coffeeshop discovery product with authentication, reviews, bookmarks, filters, maps, API routes, and an admin dashboard.</w:t>
       </w:r>
     </w:p>
     <w:p>
-      <w:pPr/>
+      <w:pPr>
+        <w:spacing w:before="0" w:after="8" w:line="240" w:lineRule="auto"/>
+        <w:ind w:left="144"/>
+      </w:pPr>
+      <w:r>
+        <w:rPr>
+          <w:rFonts w:ascii="Arial" w:hAnsi="Arial" w:eastAsia="Arial"/>
+          <w:b w:val="0"/>
+          <w:color w:val="333333"/>
+          <w:sz w:val="17"/>
+        </w:rPr>
+        <w:t>Next.js, TypeScript, PostgreSQL, Prisma, Tailwind CSS | Live: kopikarawang.vercel.app | GitHub: github.com/chandra7251/coffe_karawang</w:t>
+      </w:r>
+    </w:p>
+    <w:p>
+      <w:pPr>
+        <w:spacing w:before="30" w:after="6" w:line="240" w:lineRule="auto"/>
+      </w:pPr>
       <w:r>
         <w:rPr>
           <w:rFonts w:ascii="Arial" w:hAnsi="Arial" w:eastAsia="Arial"/>
           <w:b/>
-          <w:color w:val="000000"/>
+          <w:color w:val="111111"/>
+          <w:sz w:val="19"/>
         </w:rPr>
-        <w:t xml:space="preserve">Soft Skills: </w:t>
+        <w:t>VisuaLearn | UX Design Project, GEMASTIK XIX 2026</w:t>
+      </w:r>
+    </w:p>
+    <w:p>
+      <w:pPr>
+        <w:spacing w:before="0" w:after="5" w:line="250" w:lineRule="auto"/>
+        <w:ind w:left="144"/>
+      </w:pPr>
+      <w:r>
+        <w:rPr>
+          <w:rFonts w:ascii="Arial" w:hAnsi="Arial" w:eastAsia="Arial"/>
+          <w:b/>
+          <w:color w:val="111111"/>
+          <w:sz w:val="18"/>
+        </w:rPr>
+        <w:t xml:space="preserve">- </w:t>
       </w:r>
       <w:r>
         <w:rPr>
           <w:rFonts w:ascii="Arial" w:hAnsi="Arial" w:eastAsia="Arial"/>
-          <w:color w:val="000000"/>
+          <w:b w:val="0"/>
+          <w:color w:val="111111"/>
+          <w:sz w:val="18"/>
         </w:rPr>
-        <w:t>Problem solving, teamwork, communication, adaptability, time management, bertanggung jawab</w:t>
+        <w:t>Led UX work for an accessible academic-information concept for Deaf students: exploratory research, user journeys, co-design, high-fidelity prototype, and two usability-testing iterations.</w:t>
       </w:r>
     </w:p>
     <w:p>
-      <w:pPr/>
+      <w:pPr>
+        <w:spacing w:before="0" w:after="8" w:line="240" w:lineRule="auto"/>
+        <w:ind w:left="144"/>
+      </w:pPr>
+      <w:r>
+        <w:rPr>
+          <w:rFonts w:ascii="Arial" w:hAnsi="Arial" w:eastAsia="Arial"/>
+          <w:b w:val="0"/>
+          <w:color w:val="333333"/>
+          <w:sz w:val="17"/>
+        </w:rPr>
+        <w:t>Figma, FigJam, UX Research, Usability Testing</w:t>
+      </w:r>
+    </w:p>
+    <w:p>
+      <w:pPr>
+        <w:spacing w:before="100" w:after="60" w:line="240" w:lineRule="auto"/>
+        <w:pBdr>
+          <w:bottom w:val="single" w:sz="6" w:space="2" w:color="000000"/>
+        </w:pBdr>
+      </w:pPr>
       <w:r>
         <w:rPr>
           <w:rFonts w:ascii="Arial" w:hAnsi="Arial" w:eastAsia="Arial"/>
           <w:b/>
-          <w:color w:val="000000"/>
+          <w:color w:val="111111"/>
+          <w:sz w:val="21"/>
         </w:rPr>
-        <w:t xml:space="preserve">Bahasa: </w:t>
+        <w:t>ADDITIONAL PROJECTS</w:t>
+      </w:r>
+    </w:p>
+    <w:p>
+      <w:pPr>
+        <w:spacing w:before="0" w:after="8" w:line="247" w:lineRule="auto"/>
+      </w:pPr>
+      <w:r>
+        <w:rPr>
+          <w:rFonts w:ascii="Arial" w:hAnsi="Arial" w:eastAsia="Arial"/>
+          <w:b w:val="0"/>
+          <w:color w:val="111111"/>
+          <w:sz w:val="18"/>
+        </w:rPr>
+        <w:t>Mobile E-Tender (Ionic, REST API); E-Procurement API (Laravel, REST API); KeuanganKu (Laravel, MySQL); Hunter-Log (Ionic, SQLite).</w:t>
+      </w:r>
+    </w:p>
+    <w:p>
+      <w:pPr>
+        <w:spacing w:before="100" w:after="60" w:line="240" w:lineRule="auto"/>
+        <w:pBdr>
+          <w:bottom w:val="single" w:sz="6" w:space="2" w:color="000000"/>
+        </w:pBdr>
+      </w:pPr>
+      <w:r>
+        <w:rPr>
+          <w:rFonts w:ascii="Arial" w:hAnsi="Arial" w:eastAsia="Arial"/>
+          <w:b/>
+          <w:color w:val="111111"/>
+          <w:sz w:val="21"/>
+        </w:rPr>
+        <w:t>EDUCATION</w:t>
+      </w:r>
+    </w:p>
+    <w:p>
+      <w:pPr>
+        <w:spacing w:before="0" w:after="8" w:line="240" w:lineRule="auto"/>
+      </w:pPr>
+      <w:r>
+        <w:rPr>
+          <w:rFonts w:ascii="Arial" w:hAnsi="Arial" w:eastAsia="Arial"/>
+          <w:b/>
+          <w:color w:val="111111"/>
+          <w:sz w:val="19"/>
+        </w:rPr>
+        <w:t>Universitas Buana Perjuangan Karawang</w:t>
       </w:r>
       <w:r>
         <w:rPr>
           <w:rFonts w:ascii="Arial" w:hAnsi="Arial" w:eastAsia="Arial"/>
-          <w:color w:val="000000"/>
+          <w:b w:val="0"/>
+          <w:color w:val="111111"/>
+          <w:sz w:val="19"/>
         </w:rPr>
-        <w:t>Indonesia; English - basic/intermediate</w:t>
+        <w:t xml:space="preserve"> | B.S. Informatics Engineering | 2024-Present | GPA: 3.77/4.00</w:t>
+      </w:r>
+    </w:p>
+    <w:p>
+      <w:pPr>
+        <w:spacing w:before="100" w:after="60" w:line="240" w:lineRule="auto"/>
+        <w:pBdr>
+          <w:bottom w:val="single" w:sz="6" w:space="2" w:color="000000"/>
+        </w:pBdr>
+      </w:pPr>
+      <w:r>
+        <w:rPr>
+          <w:rFonts w:ascii="Arial" w:hAnsi="Arial" w:eastAsia="Arial"/>
+          <w:b/>
+          <w:color w:val="111111"/>
+          <w:sz w:val="21"/>
+        </w:rPr>
+        <w:t>PROFESSIONAL EXPERIENCE</w:t>
+      </w:r>
+    </w:p>
+    <w:p>
+      <w:pPr>
+        <w:spacing w:before="0" w:after="6" w:line="240" w:lineRule="auto"/>
+      </w:pPr>
+      <w:r>
+        <w:rPr>
+          <w:rFonts w:ascii="Arial" w:hAnsi="Arial" w:eastAsia="Arial"/>
+          <w:b/>
+          <w:color w:val="111111"/>
+          <w:sz w:val="19"/>
+        </w:rPr>
+        <w:t>PT AT Indonesia | Production Operator | June 2023-June 2024</w:t>
+      </w:r>
+    </w:p>
+    <w:p>
+      <w:pPr>
+        <w:spacing w:before="0" w:after="0" w:line="240" w:lineRule="auto"/>
+        <w:ind w:left="144"/>
+      </w:pPr>
+      <w:r>
+        <w:rPr>
+          <w:rFonts w:ascii="Arial" w:hAnsi="Arial" w:eastAsia="Arial"/>
+          <w:b w:val="0"/>
+          <w:color w:val="111111"/>
+          <w:sz w:val="17"/>
+        </w:rPr>
+        <w:t>- Followed machining SOPs and quality standards while collaborating to meet daily production targets.</w:t>
       </w:r>
     </w:p>
     <w:sectPr>
       <w:pgSz w:w="12240" w:h="15840"/>
-      <w:pgMar w:top="792" w:right="936" w:bottom="792" w:left="936" w:header="720" w:footer="720" w:gutter="0"/>
+      <w:pgMar w:top="648" w:right="806" w:bottom="605" w:left="806" w:header="720" w:footer="720" w:gutter="0"/>
       <w:cols w:space="720"/>
       <w:docGrid w:linePitch="360"/>
     </w:sectPr>
@@ -857,12 +899,11 @@
     <w:qFormat/>
     <w:rsid w:val="00FC693F"/>
     <w:pPr>
-      <w:spacing w:after="40" w:line="240" w:lineRule="auto"/>
+      <w:spacing w:after="0"/>
     </w:pPr>
     <w:rPr>
       <w:rFonts w:ascii="Arial" w:hAnsi="Arial" w:eastAsia="Arial"/>
-      <w:color w:val="000000"/>
-      <w:sz w:val="18"/>
+      <w:sz w:val="19"/>
     </w:rPr>
   </w:style>
   <w:style w:type="paragraph" w:styleId="Header">
@@ -920,15 +961,15 @@
     <w:pPr>
       <w:keepNext/>
       <w:keepLines/>
-      <w:spacing w:before="100" w:after="40"/>
+      <w:spacing w:before="480" w:after="0"/>
       <w:outlineLvl w:val="0"/>
     </w:pPr>
     <w:rPr>
-      <w:rFonts w:asciiTheme="majorHAnsi" w:eastAsiaTheme="majorEastAsia" w:hAnsiTheme="majorHAnsi" w:cstheme="majorBidi" w:ascii="Arial" w:hAnsi="Arial" w:eastAsia="Arial"/>
+      <w:rFonts w:asciiTheme="majorHAnsi" w:eastAsiaTheme="majorEastAsia" w:hAnsiTheme="majorHAnsi" w:cstheme="majorBidi"/>
       <w:b/>
       <w:bCs/>
-      <w:color w:val="000000"/>
-      <w:sz w:val="20"/>
+      <w:color w:val="365F91" w:themeColor="accent1" w:themeShade="BF"/>
+      <w:sz w:val="28"/>
       <w:szCs w:val="28"/>
     </w:rPr>
   </w:style>
@@ -944,15 +985,15 @@
     <w:pPr>
       <w:keepNext/>
       <w:keepLines/>
-      <w:spacing w:before="100" w:after="40"/>
+      <w:spacing w:before="200" w:after="0"/>
       <w:outlineLvl w:val="1"/>
     </w:pPr>
     <w:rPr>
-      <w:rFonts w:asciiTheme="majorHAnsi" w:eastAsiaTheme="majorEastAsia" w:hAnsiTheme="majorHAnsi" w:cstheme="majorBidi" w:ascii="Arial" w:hAnsi="Arial" w:eastAsia="Arial"/>
+      <w:rFonts w:asciiTheme="majorHAnsi" w:eastAsiaTheme="majorEastAsia" w:hAnsiTheme="majorHAnsi" w:cstheme="majorBidi"/>
       <w:b/>
       <w:bCs/>
-      <w:color w:val="000000"/>
-      <w:sz w:val="18"/>
+      <w:color w:val="4F81BD" w:themeColor="accent1"/>
+      <w:sz w:val="26"/>
       <w:szCs w:val="26"/>
     </w:rPr>
   </w:style>

</xml_diff>

<commit_message>
Expand resume projects and experience
</commit_message>
<xml_diff>
--- a/output/docx/Chandra_Aditiya_Putra_CV_Magang_ATS.docx
+++ b/output/docx/Chandra_Aditiya_Putra_CV_Magang_ATS.docx
@@ -90,7 +90,7 @@
           <w:color w:val="111111"/>
           <w:sz w:val="19"/>
         </w:rPr>
-        <w:t>Informatics Engineering student with a 3.77 GPA and hands-on experience building web, mobile, and API products. Strongest contribution in Laravel/PHP backend development, MySQL data modeling, REST APIs, JWT authentication, and deployment. Comfortable delivering product interfaces with React, Next.js, Ionic, and Tailwind CSS. Seeking a full-stack or backend engineering internship.</w:t>
+        <w:t>Backend-focused Fullstack Developer and Informatics Engineering student with a 3.77 GPA. Builds Laravel/PHP systems using MySQL, REST APIs, JWT authentication, and deployment, then connects them to React, Next.js, and Ionic interfaces.</w:t>
       </w:r>
     </w:p>
     <w:p>
@@ -231,7 +231,7 @@
           <w:color w:val="111111"/>
           <w:sz w:val="18"/>
         </w:rPr>
-        <w:t>Led backend delivery for a five-person academic final project. Built Laravel/PHP services, MySQL data model, JWT authentication, and deployment for vendor, tender, bidding, contract, audit-log, and document workflows. Mobile app published on Google Play Store.</w:t>
+        <w:t>Led backend delivery for a five-person academic final project. Designed Laravel/PHP services and MySQL data structures supporting vendors, tenders, bidding, digital contracts, audit logs, document exports, and notifications. Implemented JWT authentication and deployment; mobile companion is published on Google Play Store.</w:t>
       </w:r>
     </w:p>
     <w:p>
@@ -284,7 +284,7 @@
           <w:color w:val="111111"/>
           <w:sz w:val="18"/>
         </w:rPr>
-        <w:t>Built a cafe point-of-sale workflow for cashier and owner roles, covering transactions, sales monitoring, and an operations dashboard.</w:t>
+        <w:t>Developed a cafe POS application for cashier and owner roles. Built transaction workflows, sales monitoring, and an operational dashboard, connecting Laravel/PHP backend logic with React interfaces and MySQL data.</w:t>
       </w:r>
     </w:p>
     <w:p>
@@ -337,7 +337,7 @@
           <w:color w:val="111111"/>
           <w:sz w:val="18"/>
         </w:rPr>
-        <w:t>Built a cafe and coffeeshop discovery product with authentication, reviews, bookmarks, filters, maps, API routes, and an admin dashboard.</w:t>
+        <w:t>Built a Karawang cafe and coffeeshop directory with authentication, reviews, bookmarks, filters, maps, API routes, and an admin dashboard. Delivered a public full-stack product with Next.js, TypeScript, PostgreSQL, Prisma, and Tailwind CSS.</w:t>
       </w:r>
     </w:p>
     <w:p>
@@ -390,7 +390,7 @@
           <w:color w:val="111111"/>
           <w:sz w:val="18"/>
         </w:rPr>
-        <w:t>Led UX work for an accessible academic-information concept for Deaf students: exploratory research, user journeys, co-design, high-fidelity prototype, and two usability-testing iterations.</w:t>
+        <w:t>Led UX design for an accessible academic-information concept for Deaf students. Conducted exploratory research, user journeys, co-design, high-fidelity prototyping, and two usability-testing iterations.</w:t>
       </w:r>
     </w:p>
     <w:p>
@@ -522,7 +522,36 @@
           <w:color w:val="111111"/>
           <w:sz w:val="17"/>
         </w:rPr>
-        <w:t>- Followed machining SOPs and quality standards while collaborating to meet daily production targets.</w:t>
+        <w:t>- Operated machining processes under SOPs, safety requirements, and quality standards while collaborating to meet daily production targets.</w:t>
+      </w:r>
+    </w:p>
+    <w:p>
+      <w:pPr>
+        <w:spacing w:before="30" w:after="6" w:line="240" w:lineRule="auto"/>
+      </w:pPr>
+      <w:r>
+        <w:rPr>
+          <w:rFonts w:ascii="Arial" w:hAnsi="Arial" w:eastAsia="Arial"/>
+          <w:b/>
+          <w:color w:val="111111"/>
+          <w:sz w:val="19"/>
+        </w:rPr>
+        <w:t>PT Marutake Miyama Indonesia | Quality Inspection Intern (PKL) | November 2021-January 2022</w:t>
+      </w:r>
+    </w:p>
+    <w:p>
+      <w:pPr>
+        <w:spacing w:before="0" w:after="0" w:line="240" w:lineRule="auto"/>
+        <w:ind w:left="144"/>
+      </w:pPr>
+      <w:r>
+        <w:rPr>
+          <w:rFonts w:ascii="Arial" w:hAnsi="Arial" w:eastAsia="Arial"/>
+          <w:b w:val="0"/>
+          <w:color w:val="111111"/>
+          <w:sz w:val="17"/>
+        </w:rPr>
+        <w:t>- Inspected products against quality standards, identified nonconforming units for repair, and completed packing for accepted products.</w:t>
       </w:r>
     </w:p>
     <w:sectPr>

</xml_diff>

<commit_message>
Refine resume with detailed project evidence
</commit_message>
<xml_diff>
--- a/output/docx/Chandra_Aditiya_Putra_CV_Magang_ATS.docx
+++ b/output/docx/Chandra_Aditiya_Putra_CV_Magang_ATS.docx
@@ -12,14 +12,14 @@
           <w:rFonts w:ascii="Arial" w:hAnsi="Arial" w:eastAsia="Arial"/>
           <w:b/>
           <w:color w:val="111111"/>
-          <w:sz w:val="40"/>
+          <w:sz w:val="41"/>
         </w:rPr>
         <w:t>Chandra Aditiya Putra</w:t>
       </w:r>
     </w:p>
     <w:p>
       <w:pPr>
-        <w:spacing w:before="0" w:after="40" w:line="240" w:lineRule="auto"/>
+        <w:spacing w:before="0" w:after="30" w:line="240" w:lineRule="auto"/>
         <w:jc w:val="center"/>
       </w:pPr>
       <w:r>
@@ -27,14 +27,14 @@
           <w:rFonts w:ascii="Arial" w:hAnsi="Arial" w:eastAsia="Arial"/>
           <w:b/>
           <w:color w:val="111111"/>
-          <w:sz w:val="22"/>
+          <w:sz w:val="21"/>
         </w:rPr>
         <w:t>Fullstack Developer | Backend-Focused</w:t>
       </w:r>
     </w:p>
     <w:p>
       <w:pPr>
-        <w:spacing w:before="0" w:after="80" w:line="252" w:lineRule="auto"/>
+        <w:spacing w:before="0" w:after="6" w:line="240" w:lineRule="auto"/>
         <w:jc w:val="center"/>
       </w:pPr>
       <w:r>
@@ -44,12 +44,12 @@
           <w:color w:val="111111"/>
           <w:sz w:val="17"/>
         </w:rPr>
-        <w:t>Karawang, Indonesia  |  chandraaditiyaputra80@gmail.com  |  portofolio-chandra.vercel.app</w:t>
+        <w:t>Karawang, Indonesia | chandraaditiyaputra80@gmail.com | portofolio-chandra.vercel.app</w:t>
       </w:r>
     </w:p>
     <w:p>
       <w:pPr>
-        <w:spacing w:before="0" w:after="20" w:line="252" w:lineRule="auto"/>
+        <w:spacing w:before="0" w:after="6" w:line="240" w:lineRule="auto"/>
         <w:jc w:val="center"/>
       </w:pPr>
       <w:r>
@@ -59,375 +59,12 @@
           <w:color w:val="111111"/>
           <w:sz w:val="17"/>
         </w:rPr>
-        <w:t>github.com/chandra7251  |  linkedin.com/in/chandra-aditiya-putra-189249385</w:t>
+        <w:t>github.com/chandra7251 | linkedin.com/in/chandra-aditiya-putra-189249385</w:t>
       </w:r>
     </w:p>
     <w:p>
       <w:pPr>
-        <w:spacing w:before="100" w:after="60" w:line="240" w:lineRule="auto"/>
-        <w:pBdr>
-          <w:bottom w:val="single" w:sz="6" w:space="2" w:color="000000"/>
-        </w:pBdr>
-      </w:pPr>
-      <w:r>
-        <w:rPr>
-          <w:rFonts w:ascii="Arial" w:hAnsi="Arial" w:eastAsia="Arial"/>
-          <w:b/>
-          <w:color w:val="111111"/>
-          <w:sz w:val="21"/>
-        </w:rPr>
-        <w:t>PROFESSIONAL SUMMARY</w:t>
-      </w:r>
-    </w:p>
-    <w:p>
-      <w:pPr>
-        <w:spacing w:before="0" w:after="20" w:line="252" w:lineRule="auto"/>
-      </w:pPr>
-      <w:r>
-        <w:rPr>
-          <w:rFonts w:ascii="Arial" w:hAnsi="Arial" w:eastAsia="Arial"/>
-          <w:b w:val="0"/>
-          <w:color w:val="111111"/>
-          <w:sz w:val="19"/>
-        </w:rPr>
-        <w:t>Backend-focused Fullstack Developer and Informatics Engineering student with a 3.77 GPA. Builds Laravel/PHP systems using MySQL, REST APIs, JWT authentication, and deployment, then connects them to React, Next.js, and Ionic interfaces.</w:t>
-      </w:r>
-    </w:p>
-    <w:p>
-      <w:pPr>
-        <w:spacing w:before="100" w:after="60" w:line="240" w:lineRule="auto"/>
-        <w:pBdr>
-          <w:bottom w:val="single" w:sz="6" w:space="2" w:color="000000"/>
-        </w:pBdr>
-      </w:pPr>
-      <w:r>
-        <w:rPr>
-          <w:rFonts w:ascii="Arial" w:hAnsi="Arial" w:eastAsia="Arial"/>
-          <w:b/>
-          <w:color w:val="111111"/>
-          <w:sz w:val="21"/>
-        </w:rPr>
-        <w:t>TECHNICAL SKILLS</w:t>
-      </w:r>
-    </w:p>
-    <w:p>
-      <w:pPr>
-        <w:spacing w:before="0" w:after="10" w:line="240" w:lineRule="auto"/>
-      </w:pPr>
-      <w:r>
-        <w:rPr>
-          <w:rFonts w:ascii="Arial" w:hAnsi="Arial" w:eastAsia="Arial"/>
-          <w:b/>
-          <w:color w:val="111111"/>
-          <w:sz w:val="19"/>
-        </w:rPr>
-        <w:t xml:space="preserve">Backend &amp; Data: </w:t>
-      </w:r>
-      <w:r>
-        <w:rPr>
-          <w:rFonts w:ascii="Arial" w:hAnsi="Arial" w:eastAsia="Arial"/>
-          <w:b w:val="0"/>
-          <w:color w:val="111111"/>
-          <w:sz w:val="19"/>
-        </w:rPr>
-        <w:t>Laravel, PHP, MySQL, PostgreSQL, REST API, JWT Authentication, Prisma, Filament</w:t>
-      </w:r>
-    </w:p>
-    <w:p>
-      <w:pPr>
-        <w:spacing w:before="0" w:after="10" w:line="240" w:lineRule="auto"/>
-      </w:pPr>
-      <w:r>
-        <w:rPr>
-          <w:rFonts w:ascii="Arial" w:hAnsi="Arial" w:eastAsia="Arial"/>
-          <w:b/>
-          <w:color w:val="111111"/>
-          <w:sz w:val="19"/>
-        </w:rPr>
-        <w:t xml:space="preserve">Frontend &amp; Mobile: </w:t>
-      </w:r>
-      <w:r>
-        <w:rPr>
-          <w:rFonts w:ascii="Arial" w:hAnsi="Arial" w:eastAsia="Arial"/>
-          <w:b w:val="0"/>
-          <w:color w:val="111111"/>
-          <w:sz w:val="19"/>
-        </w:rPr>
-        <w:t>React, Next.js, JavaScript, TypeScript, Ionic, Blade, Tailwind CSS</w:t>
-      </w:r>
-    </w:p>
-    <w:p>
-      <w:pPr>
-        <w:spacing w:before="0" w:after="10" w:line="240" w:lineRule="auto"/>
-      </w:pPr>
-      <w:r>
-        <w:rPr>
-          <w:rFonts w:ascii="Arial" w:hAnsi="Arial" w:eastAsia="Arial"/>
-          <w:b/>
-          <w:color w:val="111111"/>
-          <w:sz w:val="19"/>
-        </w:rPr>
-        <w:t xml:space="preserve">Workflow &amp; Deployment: </w:t>
-      </w:r>
-      <w:r>
-        <w:rPr>
-          <w:rFonts w:ascii="Arial" w:hAnsi="Arial" w:eastAsia="Arial"/>
-          <w:b w:val="0"/>
-          <w:color w:val="111111"/>
-          <w:sz w:val="19"/>
-        </w:rPr>
-        <w:t>Node.js, Git, GitHub, Vercel</w:t>
-      </w:r>
-    </w:p>
-    <w:p>
-      <w:pPr>
-        <w:spacing w:before="100" w:after="60" w:line="240" w:lineRule="auto"/>
-        <w:pBdr>
-          <w:bottom w:val="single" w:sz="6" w:space="2" w:color="000000"/>
-        </w:pBdr>
-      </w:pPr>
-      <w:r>
-        <w:rPr>
-          <w:rFonts w:ascii="Arial" w:hAnsi="Arial" w:eastAsia="Arial"/>
-          <w:b/>
-          <w:color w:val="111111"/>
-          <w:sz w:val="21"/>
-        </w:rPr>
-        <w:t>SELECTED PROJECTS</w:t>
-      </w:r>
-    </w:p>
-    <w:p>
-      <w:pPr>
-        <w:spacing w:before="30" w:after="6" w:line="240" w:lineRule="auto"/>
-      </w:pPr>
-      <w:r>
-        <w:rPr>
-          <w:rFonts w:ascii="Arial" w:hAnsi="Arial" w:eastAsia="Arial"/>
-          <w:b/>
-          <w:color w:val="111111"/>
-          <w:sz w:val="19"/>
-        </w:rPr>
-        <w:t>ZETA E-Procurement | Team Lead, Backend, Database, Authentication &amp; Deployment</w:t>
-      </w:r>
-    </w:p>
-    <w:p>
-      <w:pPr>
-        <w:spacing w:before="0" w:after="5" w:line="250" w:lineRule="auto"/>
-        <w:ind w:left="144"/>
-      </w:pPr>
-      <w:r>
-        <w:rPr>
-          <w:rFonts w:ascii="Arial" w:hAnsi="Arial" w:eastAsia="Arial"/>
-          <w:b/>
-          <w:color w:val="111111"/>
-          <w:sz w:val="18"/>
-        </w:rPr>
-        <w:t xml:space="preserve">- </w:t>
-      </w:r>
-      <w:r>
-        <w:rPr>
-          <w:rFonts w:ascii="Arial" w:hAnsi="Arial" w:eastAsia="Arial"/>
-          <w:b w:val="0"/>
-          <w:color w:val="111111"/>
-          <w:sz w:val="18"/>
-        </w:rPr>
-        <w:t>Led backend delivery for a five-person academic final project. Designed Laravel/PHP services and MySQL data structures supporting vendors, tenders, bidding, digital contracts, audit logs, document exports, and notifications. Implemented JWT authentication and deployment; mobile companion is published on Google Play Store.</w:t>
-      </w:r>
-    </w:p>
-    <w:p>
-      <w:pPr>
-        <w:spacing w:before="0" w:after="8" w:line="240" w:lineRule="auto"/>
-        <w:ind w:left="144"/>
-      </w:pPr>
-      <w:r>
-        <w:rPr>
-          <w:rFonts w:ascii="Arial" w:hAnsi="Arial" w:eastAsia="Arial"/>
-          <w:b w:val="0"/>
-          <w:color w:val="333333"/>
-          <w:sz w:val="17"/>
-        </w:rPr>
-        <w:t>Laravel, PHP, MySQL, JWT, Blade, Tailwind CSS | Google Play: play.google.com/store/apps/details?id=com.vandrafcy.zeta</w:t>
-      </w:r>
-    </w:p>
-    <w:p>
-      <w:pPr>
-        <w:spacing w:before="30" w:after="6" w:line="240" w:lineRule="auto"/>
-      </w:pPr>
-      <w:r>
-        <w:rPr>
-          <w:rFonts w:ascii="Arial" w:hAnsi="Arial" w:eastAsia="Arial"/>
-          <w:b/>
-          <w:color w:val="111111"/>
-          <w:sz w:val="19"/>
-        </w:rPr>
-        <w:t>Cashier &amp; Owner | Point-of-Sale Web Application</w:t>
-      </w:r>
-    </w:p>
-    <w:p>
-      <w:pPr>
-        <w:spacing w:before="0" w:after="5" w:line="250" w:lineRule="auto"/>
-        <w:ind w:left="144"/>
-      </w:pPr>
-      <w:r>
-        <w:rPr>
-          <w:rFonts w:ascii="Arial" w:hAnsi="Arial" w:eastAsia="Arial"/>
-          <w:b/>
-          <w:color w:val="111111"/>
-          <w:sz w:val="18"/>
-        </w:rPr>
-        <w:t xml:space="preserve">- </w:t>
-      </w:r>
-      <w:r>
-        <w:rPr>
-          <w:rFonts w:ascii="Arial" w:hAnsi="Arial" w:eastAsia="Arial"/>
-          <w:b w:val="0"/>
-          <w:color w:val="111111"/>
-          <w:sz w:val="18"/>
-        </w:rPr>
-        <w:t>Developed a cafe POS application for cashier and owner roles. Built transaction workflows, sales monitoring, and an operational dashboard, connecting Laravel/PHP backend logic with React interfaces and MySQL data.</w:t>
-      </w:r>
-    </w:p>
-    <w:p>
-      <w:pPr>
-        <w:spacing w:before="0" w:after="8" w:line="240" w:lineRule="auto"/>
-        <w:ind w:left="144"/>
-      </w:pPr>
-      <w:r>
-        <w:rPr>
-          <w:rFonts w:ascii="Arial" w:hAnsi="Arial" w:eastAsia="Arial"/>
-          <w:b w:val="0"/>
-          <w:color w:val="333333"/>
-          <w:sz w:val="17"/>
-        </w:rPr>
-        <w:t>Laravel, PHP, MySQL, React | GitHub: github.com/chandra7251</w:t>
-      </w:r>
-    </w:p>
-    <w:p>
-      <w:pPr>
-        <w:spacing w:before="30" w:after="6" w:line="240" w:lineRule="auto"/>
-      </w:pPr>
-      <w:r>
-        <w:rPr>
-          <w:rFonts w:ascii="Arial" w:hAnsi="Arial" w:eastAsia="Arial"/>
-          <w:b/>
-          <w:color w:val="111111"/>
-          <w:sz w:val="19"/>
-        </w:rPr>
-        <w:t>Coffee Karawang | Full-Stack Cafe Directory</w:t>
-      </w:r>
-    </w:p>
-    <w:p>
-      <w:pPr>
-        <w:spacing w:before="0" w:after="5" w:line="250" w:lineRule="auto"/>
-        <w:ind w:left="144"/>
-      </w:pPr>
-      <w:r>
-        <w:rPr>
-          <w:rFonts w:ascii="Arial" w:hAnsi="Arial" w:eastAsia="Arial"/>
-          <w:b/>
-          <w:color w:val="111111"/>
-          <w:sz w:val="18"/>
-        </w:rPr>
-        <w:t xml:space="preserve">- </w:t>
-      </w:r>
-      <w:r>
-        <w:rPr>
-          <w:rFonts w:ascii="Arial" w:hAnsi="Arial" w:eastAsia="Arial"/>
-          <w:b w:val="0"/>
-          <w:color w:val="111111"/>
-          <w:sz w:val="18"/>
-        </w:rPr>
-        <w:t>Built a Karawang cafe and coffeeshop directory with authentication, reviews, bookmarks, filters, maps, API routes, and an admin dashboard. Delivered a public full-stack product with Next.js, TypeScript, PostgreSQL, Prisma, and Tailwind CSS.</w:t>
-      </w:r>
-    </w:p>
-    <w:p>
-      <w:pPr>
-        <w:spacing w:before="0" w:after="8" w:line="240" w:lineRule="auto"/>
-        <w:ind w:left="144"/>
-      </w:pPr>
-      <w:r>
-        <w:rPr>
-          <w:rFonts w:ascii="Arial" w:hAnsi="Arial" w:eastAsia="Arial"/>
-          <w:b w:val="0"/>
-          <w:color w:val="333333"/>
-          <w:sz w:val="17"/>
-        </w:rPr>
-        <w:t>Next.js, TypeScript, PostgreSQL, Prisma, Tailwind CSS | Live: kopikarawang.vercel.app | GitHub: github.com/chandra7251/coffe_karawang</w:t>
-      </w:r>
-    </w:p>
-    <w:p>
-      <w:pPr>
-        <w:spacing w:before="30" w:after="6" w:line="240" w:lineRule="auto"/>
-      </w:pPr>
-      <w:r>
-        <w:rPr>
-          <w:rFonts w:ascii="Arial" w:hAnsi="Arial" w:eastAsia="Arial"/>
-          <w:b/>
-          <w:color w:val="111111"/>
-          <w:sz w:val="19"/>
-        </w:rPr>
-        <w:t>VisuaLearn | UX Design Project, GEMASTIK XIX 2026</w:t>
-      </w:r>
-    </w:p>
-    <w:p>
-      <w:pPr>
-        <w:spacing w:before="0" w:after="5" w:line="250" w:lineRule="auto"/>
-        <w:ind w:left="144"/>
-      </w:pPr>
-      <w:r>
-        <w:rPr>
-          <w:rFonts w:ascii="Arial" w:hAnsi="Arial" w:eastAsia="Arial"/>
-          <w:b/>
-          <w:color w:val="111111"/>
-          <w:sz w:val="18"/>
-        </w:rPr>
-        <w:t xml:space="preserve">- </w:t>
-      </w:r>
-      <w:r>
-        <w:rPr>
-          <w:rFonts w:ascii="Arial" w:hAnsi="Arial" w:eastAsia="Arial"/>
-          <w:b w:val="0"/>
-          <w:color w:val="111111"/>
-          <w:sz w:val="18"/>
-        </w:rPr>
-        <w:t>Led UX design for an accessible academic-information concept for Deaf students. Conducted exploratory research, user journeys, co-design, high-fidelity prototyping, and two usability-testing iterations.</w:t>
-      </w:r>
-    </w:p>
-    <w:p>
-      <w:pPr>
-        <w:spacing w:before="0" w:after="8" w:line="240" w:lineRule="auto"/>
-        <w:ind w:left="144"/>
-      </w:pPr>
-      <w:r>
-        <w:rPr>
-          <w:rFonts w:ascii="Arial" w:hAnsi="Arial" w:eastAsia="Arial"/>
-          <w:b w:val="0"/>
-          <w:color w:val="333333"/>
-          <w:sz w:val="17"/>
-        </w:rPr>
-        <w:t>Figma, FigJam, UX Research, Usability Testing</w:t>
-      </w:r>
-    </w:p>
-    <w:p>
-      <w:pPr>
-        <w:spacing w:before="100" w:after="60" w:line="240" w:lineRule="auto"/>
-        <w:pBdr>
-          <w:bottom w:val="single" w:sz="6" w:space="2" w:color="000000"/>
-        </w:pBdr>
-      </w:pPr>
-      <w:r>
-        <w:rPr>
-          <w:rFonts w:ascii="Arial" w:hAnsi="Arial" w:eastAsia="Arial"/>
-          <w:b/>
-          <w:color w:val="111111"/>
-          <w:sz w:val="21"/>
-        </w:rPr>
-        <w:t>ADDITIONAL PROJECTS</w:t>
-      </w:r>
-    </w:p>
-    <w:p>
-      <w:pPr>
-        <w:spacing w:before="0" w:after="8" w:line="247" w:lineRule="auto"/>
+        <w:spacing w:before="80" w:after="20" w:line="257" w:lineRule="auto"/>
       </w:pPr>
       <w:r>
         <w:rPr>
@@ -436,12 +73,12 @@
           <w:color w:val="111111"/>
           <w:sz w:val="18"/>
         </w:rPr>
-        <w:t>Mobile E-Tender (Ionic, REST API); E-Procurement API (Laravel, REST API); KeuanganKu (Laravel, MySQL); Hunter-Log (Ionic, SQLite).</w:t>
+        <w:t>Backend-focused Fullstack Developer and Informatics Engineering student with a 3.77 GPA. Builds Laravel/PHP systems using MySQL, REST APIs, JWT authentication, and deployment, then connects them to React, Next.js, and Ionic interfaces.</w:t>
       </w:r>
     </w:p>
     <w:p>
       <w:pPr>
-        <w:spacing w:before="100" w:after="60" w:line="240" w:lineRule="auto"/>
+        <w:spacing w:before="90" w:after="50" w:line="240" w:lineRule="auto"/>
         <w:pBdr>
           <w:bottom w:val="single" w:sz="6" w:space="2" w:color="000000"/>
         </w:pBdr>
@@ -465,23 +102,533 @@
           <w:rFonts w:ascii="Arial" w:hAnsi="Arial" w:eastAsia="Arial"/>
           <w:b/>
           <w:color w:val="111111"/>
-          <w:sz w:val="19"/>
+          <w:sz w:val="18"/>
         </w:rPr>
-        <w:t>Universitas Buana Perjuangan Karawang</w:t>
+        <w:t>Universitas Buana Perjuangan Karawang | B.S. Informatics Engineering | 2024-Present | GPA: 3.77/4.00</w:t>
+      </w:r>
+    </w:p>
+    <w:p>
+      <w:pPr>
+        <w:spacing w:before="90" w:after="50" w:line="240" w:lineRule="auto"/>
+        <w:pBdr>
+          <w:bottom w:val="single" w:sz="6" w:space="2" w:color="000000"/>
+        </w:pBdr>
+      </w:pPr>
+      <w:r>
+        <w:rPr>
+          <w:rFonts w:ascii="Arial" w:hAnsi="Arial" w:eastAsia="Arial"/>
+          <w:b/>
+          <w:color w:val="111111"/>
+          <w:sz w:val="21"/>
+        </w:rPr>
+        <w:t>SELECTED PROJECTS</w:t>
+      </w:r>
+    </w:p>
+    <w:p>
+      <w:pPr>
+        <w:spacing w:before="30" w:after="3" w:line="240" w:lineRule="auto"/>
+      </w:pPr>
+      <w:r>
+        <w:rPr>
+          <w:rFonts w:ascii="Arial" w:hAnsi="Arial" w:eastAsia="Arial"/>
+          <w:b/>
+          <w:color w:val="111111"/>
+          <w:sz w:val="18"/>
+        </w:rPr>
+        <w:t>ZETA E-Procurement | Team Lead, Backend, Database, Authentication &amp; Deployment</w:t>
+      </w:r>
+    </w:p>
+    <w:p>
+      <w:pPr>
+        <w:spacing w:before="0" w:after="4" w:line="240" w:lineRule="auto"/>
+        <w:ind w:left="144"/>
+      </w:pPr>
+      <w:r>
+        <w:rPr>
+          <w:rFonts w:ascii="Arial" w:hAnsi="Arial" w:eastAsia="Arial"/>
+          <w:b w:val="0"/>
+          <w:color w:val="333333"/>
+          <w:sz w:val="16"/>
+        </w:rPr>
+        <w:t>Google Play: play.google.com/store/apps/details?id=com.vandrafcy.zeta</w:t>
+      </w:r>
+    </w:p>
+    <w:p>
+      <w:pPr>
+        <w:spacing w:before="0" w:after="2" w:line="245" w:lineRule="auto"/>
+        <w:ind w:left="144"/>
+      </w:pPr>
+      <w:r>
+        <w:rPr>
+          <w:rFonts w:ascii="Arial" w:hAnsi="Arial" w:eastAsia="Arial"/>
+          <w:b/>
+          <w:color w:val="111111"/>
+          <w:sz w:val="17"/>
+        </w:rPr>
+        <w:t xml:space="preserve">- </w:t>
       </w:r>
       <w:r>
         <w:rPr>
           <w:rFonts w:ascii="Arial" w:hAnsi="Arial" w:eastAsia="Arial"/>
           <w:b w:val="0"/>
           <w:color w:val="111111"/>
-          <w:sz w:val="19"/>
+          <w:sz w:val="17"/>
         </w:rPr>
-        <w:t xml:space="preserve"> | B.S. Informatics Engineering | 2024-Present | GPA: 3.77/4.00</w:t>
+        <w:t>Led a five-person academic final project for integrated goods and services procurement.</w:t>
       </w:r>
     </w:p>
     <w:p>
       <w:pPr>
-        <w:spacing w:before="100" w:after="60" w:line="240" w:lineRule="auto"/>
+        <w:spacing w:before="0" w:after="2" w:line="245" w:lineRule="auto"/>
+        <w:ind w:left="144"/>
+      </w:pPr>
+      <w:r>
+        <w:rPr>
+          <w:rFonts w:ascii="Arial" w:hAnsi="Arial" w:eastAsia="Arial"/>
+          <w:b/>
+          <w:color w:val="111111"/>
+          <w:sz w:val="17"/>
+        </w:rPr>
+        <w:t xml:space="preserve">- </w:t>
+      </w:r>
+      <w:r>
+        <w:rPr>
+          <w:rFonts w:ascii="Arial" w:hAnsi="Arial" w:eastAsia="Arial"/>
+          <w:b w:val="0"/>
+          <w:color w:val="111111"/>
+          <w:sz w:val="17"/>
+        </w:rPr>
+        <w:t>Owned Laravel/PHP backend delivery, MySQL database design, JWT authentication, and deployment.</w:t>
+      </w:r>
+    </w:p>
+    <w:p>
+      <w:pPr>
+        <w:spacing w:before="0" w:after="2" w:line="245" w:lineRule="auto"/>
+        <w:ind w:left="144"/>
+      </w:pPr>
+      <w:r>
+        <w:rPr>
+          <w:rFonts w:ascii="Arial" w:hAnsi="Arial" w:eastAsia="Arial"/>
+          <w:b/>
+          <w:color w:val="111111"/>
+          <w:sz w:val="17"/>
+        </w:rPr>
+        <w:t xml:space="preserve">- </w:t>
+      </w:r>
+      <w:r>
+        <w:rPr>
+          <w:rFonts w:ascii="Arial" w:hAnsi="Arial" w:eastAsia="Arial"/>
+          <w:b w:val="0"/>
+          <w:color w:val="111111"/>
+          <w:sz w:val="17"/>
+        </w:rPr>
+        <w:t>Supported vendor, tender, bidding, digital contract, audit-log, document-export, and notification workflows.</w:t>
+      </w:r>
+    </w:p>
+    <w:p>
+      <w:pPr>
+        <w:spacing w:before="0" w:after="6" w:line="240" w:lineRule="auto"/>
+        <w:ind w:left="144"/>
+      </w:pPr>
+      <w:r>
+        <w:rPr>
+          <w:rFonts w:ascii="Arial" w:hAnsi="Arial" w:eastAsia="Arial"/>
+          <w:b w:val="0"/>
+          <w:color w:val="333333"/>
+          <w:sz w:val="16"/>
+        </w:rPr>
+        <w:t>Laravel, PHP, MySQL, JWT, Blade, Tailwind CSS</w:t>
+      </w:r>
+    </w:p>
+    <w:p>
+      <w:pPr>
+        <w:spacing w:before="30" w:after="3" w:line="240" w:lineRule="auto"/>
+      </w:pPr>
+      <w:r>
+        <w:rPr>
+          <w:rFonts w:ascii="Arial" w:hAnsi="Arial" w:eastAsia="Arial"/>
+          <w:b/>
+          <w:color w:val="111111"/>
+          <w:sz w:val="18"/>
+        </w:rPr>
+        <w:t>Coffee Karawang | Full-Stack Cafe Directory</w:t>
+      </w:r>
+    </w:p>
+    <w:p>
+      <w:pPr>
+        <w:spacing w:before="0" w:after="4" w:line="240" w:lineRule="auto"/>
+        <w:ind w:left="144"/>
+      </w:pPr>
+      <w:r>
+        <w:rPr>
+          <w:rFonts w:ascii="Arial" w:hAnsi="Arial" w:eastAsia="Arial"/>
+          <w:b w:val="0"/>
+          <w:color w:val="333333"/>
+          <w:sz w:val="16"/>
+        </w:rPr>
+        <w:t>Live: kopikarawang.vercel.app | GitHub: github.com/chandra7251/coffe_karawang</w:t>
+      </w:r>
+    </w:p>
+    <w:p>
+      <w:pPr>
+        <w:spacing w:before="0" w:after="2" w:line="245" w:lineRule="auto"/>
+        <w:ind w:left="144"/>
+      </w:pPr>
+      <w:r>
+        <w:rPr>
+          <w:rFonts w:ascii="Arial" w:hAnsi="Arial" w:eastAsia="Arial"/>
+          <w:b/>
+          <w:color w:val="111111"/>
+          <w:sz w:val="17"/>
+        </w:rPr>
+        <w:t xml:space="preserve">- </w:t>
+      </w:r>
+      <w:r>
+        <w:rPr>
+          <w:rFonts w:ascii="Arial" w:hAnsi="Arial" w:eastAsia="Arial"/>
+          <w:b w:val="0"/>
+          <w:color w:val="111111"/>
+          <w:sz w:val="17"/>
+        </w:rPr>
+        <w:t>Built a public directory for finding Karawang cafes and coffeeshops by category, facilities, and location.</w:t>
+      </w:r>
+    </w:p>
+    <w:p>
+      <w:pPr>
+        <w:spacing w:before="0" w:after="2" w:line="245" w:lineRule="auto"/>
+        <w:ind w:left="144"/>
+      </w:pPr>
+      <w:r>
+        <w:rPr>
+          <w:rFonts w:ascii="Arial" w:hAnsi="Arial" w:eastAsia="Arial"/>
+          <w:b/>
+          <w:color w:val="111111"/>
+          <w:sz w:val="17"/>
+        </w:rPr>
+        <w:t xml:space="preserve">- </w:t>
+      </w:r>
+      <w:r>
+        <w:rPr>
+          <w:rFonts w:ascii="Arial" w:hAnsi="Arial" w:eastAsia="Arial"/>
+          <w:b w:val="0"/>
+          <w:color w:val="111111"/>
+          <w:sz w:val="17"/>
+        </w:rPr>
+        <w:t>Implemented authentication, reviews, bookmarks, filters, map integration, API routes, and an admin dashboard.</w:t>
+      </w:r>
+    </w:p>
+    <w:p>
+      <w:pPr>
+        <w:spacing w:before="0" w:after="2" w:line="245" w:lineRule="auto"/>
+        <w:ind w:left="144"/>
+      </w:pPr>
+      <w:r>
+        <w:rPr>
+          <w:rFonts w:ascii="Arial" w:hAnsi="Arial" w:eastAsia="Arial"/>
+          <w:b/>
+          <w:color w:val="111111"/>
+          <w:sz w:val="17"/>
+        </w:rPr>
+        <w:t xml:space="preserve">- </w:t>
+      </w:r>
+      <w:r>
+        <w:rPr>
+          <w:rFonts w:ascii="Arial" w:hAnsi="Arial" w:eastAsia="Arial"/>
+          <w:b w:val="0"/>
+          <w:color w:val="111111"/>
+          <w:sz w:val="17"/>
+        </w:rPr>
+        <w:t>Connected Next.js and TypeScript interfaces to PostgreSQL through Prisma for data-driven features.</w:t>
+      </w:r>
+    </w:p>
+    <w:p>
+      <w:pPr>
+        <w:spacing w:before="0" w:after="6" w:line="240" w:lineRule="auto"/>
+        <w:ind w:left="144"/>
+      </w:pPr>
+      <w:r>
+        <w:rPr>
+          <w:rFonts w:ascii="Arial" w:hAnsi="Arial" w:eastAsia="Arial"/>
+          <w:b w:val="0"/>
+          <w:color w:val="333333"/>
+          <w:sz w:val="16"/>
+        </w:rPr>
+        <w:t>Next.js, TypeScript, PostgreSQL, Prisma, Tailwind CSS</w:t>
+      </w:r>
+    </w:p>
+    <w:p>
+      <w:pPr>
+        <w:spacing w:before="30" w:after="3" w:line="240" w:lineRule="auto"/>
+      </w:pPr>
+      <w:r>
+        <w:rPr>
+          <w:rFonts w:ascii="Arial" w:hAnsi="Arial" w:eastAsia="Arial"/>
+          <w:b/>
+          <w:color w:val="111111"/>
+          <w:sz w:val="18"/>
+        </w:rPr>
+        <w:t>Cashier &amp; Owner | Point-of-Sale Web Application</w:t>
+      </w:r>
+    </w:p>
+    <w:p>
+      <w:pPr>
+        <w:spacing w:before="0" w:after="4" w:line="240" w:lineRule="auto"/>
+        <w:ind w:left="144"/>
+      </w:pPr>
+      <w:r>
+        <w:rPr>
+          <w:rFonts w:ascii="Arial" w:hAnsi="Arial" w:eastAsia="Arial"/>
+          <w:b w:val="0"/>
+          <w:color w:val="333333"/>
+          <w:sz w:val="16"/>
+        </w:rPr>
+        <w:t>GitHub: github.com/chandra7251</w:t>
+      </w:r>
+    </w:p>
+    <w:p>
+      <w:pPr>
+        <w:spacing w:before="0" w:after="2" w:line="245" w:lineRule="auto"/>
+        <w:ind w:left="144"/>
+      </w:pPr>
+      <w:r>
+        <w:rPr>
+          <w:rFonts w:ascii="Arial" w:hAnsi="Arial" w:eastAsia="Arial"/>
+          <w:b/>
+          <w:color w:val="111111"/>
+          <w:sz w:val="17"/>
+        </w:rPr>
+        <w:t xml:space="preserve">- </w:t>
+      </w:r>
+      <w:r>
+        <w:rPr>
+          <w:rFonts w:ascii="Arial" w:hAnsi="Arial" w:eastAsia="Arial"/>
+          <w:b w:val="0"/>
+          <w:color w:val="111111"/>
+          <w:sz w:val="17"/>
+        </w:rPr>
+        <w:t>Developed a cafe POS application for cashier and owner roles using Laravel, React, and MySQL.</w:t>
+      </w:r>
+    </w:p>
+    <w:p>
+      <w:pPr>
+        <w:spacing w:before="0" w:after="2" w:line="245" w:lineRule="auto"/>
+        <w:ind w:left="144"/>
+      </w:pPr>
+      <w:r>
+        <w:rPr>
+          <w:rFonts w:ascii="Arial" w:hAnsi="Arial" w:eastAsia="Arial"/>
+          <w:b/>
+          <w:color w:val="111111"/>
+          <w:sz w:val="17"/>
+        </w:rPr>
+        <w:t xml:space="preserve">- </w:t>
+      </w:r>
+      <w:r>
+        <w:rPr>
+          <w:rFonts w:ascii="Arial" w:hAnsi="Arial" w:eastAsia="Arial"/>
+          <w:b w:val="0"/>
+          <w:color w:val="111111"/>
+          <w:sz w:val="17"/>
+        </w:rPr>
+        <w:t>Built transaction workflows, sales monitoring, and an operational dashboard for daily cafe activities.</w:t>
+      </w:r>
+    </w:p>
+    <w:p>
+      <w:pPr>
+        <w:spacing w:before="0" w:after="6" w:line="240" w:lineRule="auto"/>
+        <w:ind w:left="144"/>
+      </w:pPr>
+      <w:r>
+        <w:rPr>
+          <w:rFonts w:ascii="Arial" w:hAnsi="Arial" w:eastAsia="Arial"/>
+          <w:b w:val="0"/>
+          <w:color w:val="333333"/>
+          <w:sz w:val="16"/>
+        </w:rPr>
+        <w:t>Laravel, PHP, React, MySQL</w:t>
+      </w:r>
+    </w:p>
+    <w:p>
+      <w:pPr>
+        <w:spacing w:before="30" w:after="3" w:line="240" w:lineRule="auto"/>
+      </w:pPr>
+      <w:r>
+        <w:rPr>
+          <w:rFonts w:ascii="Arial" w:hAnsi="Arial" w:eastAsia="Arial"/>
+          <w:b/>
+          <w:color w:val="111111"/>
+          <w:sz w:val="18"/>
+        </w:rPr>
+        <w:t>VisuaLearn | UX Design Project, GEMASTIK XIX 2026</w:t>
+      </w:r>
+    </w:p>
+    <w:p>
+      <w:pPr>
+        <w:spacing w:before="0" w:after="4" w:line="240" w:lineRule="auto"/>
+        <w:ind w:left="144"/>
+      </w:pPr>
+      <w:r>
+        <w:rPr>
+          <w:rFonts w:ascii="Arial" w:hAnsi="Arial" w:eastAsia="Arial"/>
+          <w:b w:val="0"/>
+          <w:color w:val="333333"/>
+          <w:sz w:val="16"/>
+        </w:rPr>
+        <w:t>Academic design competition project</w:t>
+      </w:r>
+    </w:p>
+    <w:p>
+      <w:pPr>
+        <w:spacing w:before="0" w:after="2" w:line="245" w:lineRule="auto"/>
+        <w:ind w:left="144"/>
+      </w:pPr>
+      <w:r>
+        <w:rPr>
+          <w:rFonts w:ascii="Arial" w:hAnsi="Arial" w:eastAsia="Arial"/>
+          <w:b/>
+          <w:color w:val="111111"/>
+          <w:sz w:val="17"/>
+        </w:rPr>
+        <w:t xml:space="preserve">- </w:t>
+      </w:r>
+      <w:r>
+        <w:rPr>
+          <w:rFonts w:ascii="Arial" w:hAnsi="Arial" w:eastAsia="Arial"/>
+          <w:b w:val="0"/>
+          <w:color w:val="111111"/>
+          <w:sz w:val="17"/>
+        </w:rPr>
+        <w:t>Led UX design for an accessible academic-information concept for Deaf students.</w:t>
+      </w:r>
+    </w:p>
+    <w:p>
+      <w:pPr>
+        <w:spacing w:before="0" w:after="2" w:line="245" w:lineRule="auto"/>
+        <w:ind w:left="144"/>
+      </w:pPr>
+      <w:r>
+        <w:rPr>
+          <w:rFonts w:ascii="Arial" w:hAnsi="Arial" w:eastAsia="Arial"/>
+          <w:b/>
+          <w:color w:val="111111"/>
+          <w:sz w:val="17"/>
+        </w:rPr>
+        <w:t xml:space="preserve">- </w:t>
+      </w:r>
+      <w:r>
+        <w:rPr>
+          <w:rFonts w:ascii="Arial" w:hAnsi="Arial" w:eastAsia="Arial"/>
+          <w:b w:val="0"/>
+          <w:color w:val="111111"/>
+          <w:sz w:val="17"/>
+        </w:rPr>
+        <w:t>Conducted exploratory research, user journeys, co-design, high-fidelity prototyping, and two usability-testing iterations.</w:t>
+      </w:r>
+    </w:p>
+    <w:p>
+      <w:pPr>
+        <w:spacing w:before="0" w:after="6" w:line="240" w:lineRule="auto"/>
+        <w:ind w:left="144"/>
+      </w:pPr>
+      <w:r>
+        <w:rPr>
+          <w:rFonts w:ascii="Arial" w:hAnsi="Arial" w:eastAsia="Arial"/>
+          <w:b w:val="0"/>
+          <w:color w:val="333333"/>
+          <w:sz w:val="16"/>
+        </w:rPr>
+        <w:t>Figma, FigJam, UX Research, Usability Testing</w:t>
+      </w:r>
+    </w:p>
+    <w:p>
+      <w:pPr>
+        <w:spacing w:before="90" w:after="50" w:line="240" w:lineRule="auto"/>
+        <w:pBdr>
+          <w:bottom w:val="single" w:sz="6" w:space="2" w:color="000000"/>
+        </w:pBdr>
+      </w:pPr>
+      <w:r>
+        <w:rPr>
+          <w:rFonts w:ascii="Arial" w:hAnsi="Arial" w:eastAsia="Arial"/>
+          <w:b/>
+          <w:color w:val="111111"/>
+          <w:sz w:val="21"/>
+        </w:rPr>
+        <w:t>TECHNICAL SKILLS</w:t>
+      </w:r>
+    </w:p>
+    <w:p>
+      <w:pPr>
+        <w:spacing w:before="0" w:after="4" w:line="240" w:lineRule="auto"/>
+      </w:pPr>
+      <w:r>
+        <w:rPr>
+          <w:rFonts w:ascii="Arial" w:hAnsi="Arial" w:eastAsia="Arial"/>
+          <w:b/>
+          <w:color w:val="111111"/>
+          <w:sz w:val="17"/>
+        </w:rPr>
+        <w:t xml:space="preserve">Backend &amp; Data: </w:t>
+      </w:r>
+      <w:r>
+        <w:rPr>
+          <w:rFonts w:ascii="Arial" w:hAnsi="Arial" w:eastAsia="Arial"/>
+          <w:b w:val="0"/>
+          <w:color w:val="111111"/>
+          <w:sz w:val="17"/>
+        </w:rPr>
+        <w:t>Laravel, PHP, MySQL, PostgreSQL, REST API, JWT Authentication, Prisma, Filament</w:t>
+      </w:r>
+    </w:p>
+    <w:p>
+      <w:pPr>
+        <w:spacing w:before="0" w:after="4" w:line="240" w:lineRule="auto"/>
+      </w:pPr>
+      <w:r>
+        <w:rPr>
+          <w:rFonts w:ascii="Arial" w:hAnsi="Arial" w:eastAsia="Arial"/>
+          <w:b/>
+          <w:color w:val="111111"/>
+          <w:sz w:val="17"/>
+        </w:rPr>
+        <w:t xml:space="preserve">Frontend &amp; Mobile: </w:t>
+      </w:r>
+      <w:r>
+        <w:rPr>
+          <w:rFonts w:ascii="Arial" w:hAnsi="Arial" w:eastAsia="Arial"/>
+          <w:b w:val="0"/>
+          <w:color w:val="111111"/>
+          <w:sz w:val="17"/>
+        </w:rPr>
+        <w:t>React, Next.js, JavaScript, TypeScript, Ionic, Blade, Tailwind CSS</w:t>
+      </w:r>
+    </w:p>
+    <w:p>
+      <w:pPr>
+        <w:spacing w:before="0" w:after="4" w:line="240" w:lineRule="auto"/>
+      </w:pPr>
+      <w:r>
+        <w:rPr>
+          <w:rFonts w:ascii="Arial" w:hAnsi="Arial" w:eastAsia="Arial"/>
+          <w:b/>
+          <w:color w:val="111111"/>
+          <w:sz w:val="17"/>
+        </w:rPr>
+        <w:t xml:space="preserve">Workflow &amp; Deployment: </w:t>
+      </w:r>
+      <w:r>
+        <w:rPr>
+          <w:rFonts w:ascii="Arial" w:hAnsi="Arial" w:eastAsia="Arial"/>
+          <w:b w:val="0"/>
+          <w:color w:val="111111"/>
+          <w:sz w:val="17"/>
+        </w:rPr>
+        <w:t>Node.js, Git, GitHub, Vercel</w:t>
+      </w:r>
+    </w:p>
+    <w:p>
+      <w:pPr>
+        <w:spacing w:before="90" w:after="50" w:line="240" w:lineRule="auto"/>
         <w:pBdr>
           <w:bottom w:val="single" w:sz="6" w:space="2" w:color="000000"/>
         </w:pBdr>
@@ -498,23 +645,32 @@
     </w:p>
     <w:p>
       <w:pPr>
-        <w:spacing w:before="0" w:after="6" w:line="240" w:lineRule="auto"/>
+        <w:spacing w:before="20" w:after="2" w:line="240" w:lineRule="auto"/>
       </w:pPr>
       <w:r>
         <w:rPr>
           <w:rFonts w:ascii="Arial" w:hAnsi="Arial" w:eastAsia="Arial"/>
           <w:b/>
           <w:color w:val="111111"/>
-          <w:sz w:val="19"/>
+          <w:sz w:val="18"/>
         </w:rPr>
         <w:t>PT AT Indonesia | Production Operator | June 2023-June 2024</w:t>
       </w:r>
     </w:p>
     <w:p>
       <w:pPr>
-        <w:spacing w:before="0" w:after="0" w:line="240" w:lineRule="auto"/>
+        <w:spacing w:before="0" w:after="2" w:line="245" w:lineRule="auto"/>
         <w:ind w:left="144"/>
       </w:pPr>
+      <w:r>
+        <w:rPr>
+          <w:rFonts w:ascii="Arial" w:hAnsi="Arial" w:eastAsia="Arial"/>
+          <w:b/>
+          <w:color w:val="111111"/>
+          <w:sz w:val="17"/>
+        </w:rPr>
+        <w:t xml:space="preserve">- </w:t>
+      </w:r>
       <w:r>
         <w:rPr>
           <w:rFonts w:ascii="Arial" w:hAnsi="Arial" w:eastAsia="Arial"/>
@@ -522,28 +678,37 @@
           <w:color w:val="111111"/>
           <w:sz w:val="17"/>
         </w:rPr>
-        <w:t>- Operated machining processes under SOPs, safety requirements, and quality standards while collaborating to meet daily production targets.</w:t>
+        <w:t>Operated machining processes under SOPs, safety requirements, and quality standards while collaborating to meet daily production targets.</w:t>
       </w:r>
     </w:p>
     <w:p>
       <w:pPr>
-        <w:spacing w:before="30" w:after="6" w:line="240" w:lineRule="auto"/>
+        <w:spacing w:before="20" w:after="2" w:line="240" w:lineRule="auto"/>
       </w:pPr>
       <w:r>
         <w:rPr>
           <w:rFonts w:ascii="Arial" w:hAnsi="Arial" w:eastAsia="Arial"/>
           <w:b/>
           <w:color w:val="111111"/>
-          <w:sz w:val="19"/>
+          <w:sz w:val="18"/>
         </w:rPr>
         <w:t>PT Marutake Miyama Indonesia | Quality Inspection Intern (PKL) | November 2021-January 2022</w:t>
       </w:r>
     </w:p>
     <w:p>
       <w:pPr>
-        <w:spacing w:before="0" w:after="0" w:line="240" w:lineRule="auto"/>
+        <w:spacing w:before="0" w:after="2" w:line="245" w:lineRule="auto"/>
         <w:ind w:left="144"/>
       </w:pPr>
+      <w:r>
+        <w:rPr>
+          <w:rFonts w:ascii="Arial" w:hAnsi="Arial" w:eastAsia="Arial"/>
+          <w:b/>
+          <w:color w:val="111111"/>
+          <w:sz w:val="17"/>
+        </w:rPr>
+        <w:t xml:space="preserve">- </w:t>
+      </w:r>
       <w:r>
         <w:rPr>
           <w:rFonts w:ascii="Arial" w:hAnsi="Arial" w:eastAsia="Arial"/>
@@ -551,12 +716,12 @@
           <w:color w:val="111111"/>
           <w:sz w:val="17"/>
         </w:rPr>
-        <w:t>- Inspected products against quality standards, identified nonconforming units for repair, and completed packing for accepted products.</w:t>
+        <w:t>Inspected products against quality standards, identified nonconforming units for repair, and completed packing for accepted products.</w:t>
       </w:r>
     </w:p>
     <w:sectPr>
       <w:pgSz w:w="12240" w:h="15840"/>
-      <w:pgMar w:top="648" w:right="806" w:bottom="605" w:left="806" w:header="720" w:footer="720" w:gutter="0"/>
+      <w:pgMar w:top="648" w:right="806" w:bottom="547" w:left="806" w:header="720" w:footer="720" w:gutter="0"/>
       <w:cols w:space="720"/>
       <w:docGrid w:linePitch="360"/>
     </w:sectPr>
@@ -927,12 +1092,9 @@
     <w:name w:val="Normal"/>
     <w:qFormat/>
     <w:rsid w:val="00FC693F"/>
-    <w:pPr>
-      <w:spacing w:after="0"/>
-    </w:pPr>
     <w:rPr>
       <w:rFonts w:ascii="Arial" w:hAnsi="Arial" w:eastAsia="Arial"/>
-      <w:sz w:val="19"/>
+      <w:sz w:val="18"/>
     </w:rPr>
   </w:style>
   <w:style w:type="paragraph" w:styleId="Header">

</xml_diff>

<commit_message>
Add Hunter Log mobile project evidence
</commit_message>
<xml_diff>
--- a/output/docx/Chandra_Aditiya_Putra_CV_Magang_ATS.docx
+++ b/output/docx/Chandra_Aditiya_Putra_CV_Magang_ATS.docx
@@ -459,6 +459,98 @@
           <w:color w:val="111111"/>
           <w:sz w:val="18"/>
         </w:rPr>
+        <w:t>Hunter-Log | Mobile Fitness Tracker</w:t>
+      </w:r>
+    </w:p>
+    <w:p>
+      <w:pPr>
+        <w:spacing w:before="0" w:after="4" w:line="240" w:lineRule="auto"/>
+        <w:ind w:left="144"/>
+      </w:pPr>
+      <w:r>
+        <w:rPr>
+          <w:rFonts w:ascii="Arial" w:hAnsi="Arial" w:eastAsia="Arial"/>
+          <w:b w:val="0"/>
+          <w:color w:val="333333"/>
+          <w:sz w:val="16"/>
+        </w:rPr>
+        <w:t>Google Play: play.google.com/store/apps/details?id=com.chandra.hunterlog | GitHub: github.com/chandra7251/Hunter-Log</w:t>
+      </w:r>
+    </w:p>
+    <w:p>
+      <w:pPr>
+        <w:spacing w:before="0" w:after="2" w:line="245" w:lineRule="auto"/>
+        <w:ind w:left="144"/>
+      </w:pPr>
+      <w:r>
+        <w:rPr>
+          <w:rFonts w:ascii="Arial" w:hAnsi="Arial" w:eastAsia="Arial"/>
+          <w:b/>
+          <w:color w:val="111111"/>
+          <w:sz w:val="17"/>
+        </w:rPr>
+        <w:t xml:space="preserve">- </w:t>
+      </w:r>
+      <w:r>
+        <w:rPr>
+          <w:rFonts w:ascii="Arial" w:hAnsi="Arial" w:eastAsia="Arial"/>
+          <w:b w:val="0"/>
+          <w:color w:val="111111"/>
+          <w:sz w:val="17"/>
+        </w:rPr>
+        <w:t>Published a Solo Leveling-themed mobile gym tracker for logging workout progress and building exercise habits.</w:t>
+      </w:r>
+    </w:p>
+    <w:p>
+      <w:pPr>
+        <w:spacing w:before="0" w:after="2" w:line="245" w:lineRule="auto"/>
+        <w:ind w:left="144"/>
+      </w:pPr>
+      <w:r>
+        <w:rPr>
+          <w:rFonts w:ascii="Arial" w:hAnsi="Arial" w:eastAsia="Arial"/>
+          <w:b/>
+          <w:color w:val="111111"/>
+          <w:sz w:val="17"/>
+        </w:rPr>
+        <w:t xml:space="preserve">- </w:t>
+      </w:r>
+      <w:r>
+        <w:rPr>
+          <w:rFonts w:ascii="Arial" w:hAnsi="Arial" w:eastAsia="Arial"/>
+          <w:b w:val="0"/>
+          <w:color w:val="111111"/>
+          <w:sz w:val="17"/>
+        </w:rPr>
+        <w:t>Developed the mobile application with Ionic and TypeScript, using SQLite for local workout data storage.</w:t>
+      </w:r>
+    </w:p>
+    <w:p>
+      <w:pPr>
+        <w:spacing w:before="0" w:after="6" w:line="240" w:lineRule="auto"/>
+        <w:ind w:left="144"/>
+      </w:pPr>
+      <w:r>
+        <w:rPr>
+          <w:rFonts w:ascii="Arial" w:hAnsi="Arial" w:eastAsia="Arial"/>
+          <w:b w:val="0"/>
+          <w:color w:val="333333"/>
+          <w:sz w:val="16"/>
+        </w:rPr>
+        <w:t>Ionic, TypeScript, SQLite</w:t>
+      </w:r>
+    </w:p>
+    <w:p>
+      <w:pPr>
+        <w:spacing w:before="30" w:after="3" w:line="240" w:lineRule="auto"/>
+      </w:pPr>
+      <w:r>
+        <w:rPr>
+          <w:rFonts w:ascii="Arial" w:hAnsi="Arial" w:eastAsia="Arial"/>
+          <w:b/>
+          <w:color w:val="111111"/>
+          <w:sz w:val="18"/>
+        </w:rPr>
         <w:t>VisuaLearn | UX Design Project, GEMASTIK XIX 2026</w:t>
       </w:r>
     </w:p>

</xml_diff>

<commit_message>
Translate resume and improve content density
</commit_message>
<xml_diff>
--- a/output/docx/Chandra_Aditiya_Putra_CV_Magang_ATS.docx
+++ b/output/docx/Chandra_Aditiya_Putra_CV_Magang_ATS.docx
@@ -29,7 +29,7 @@
           <w:color w:val="111111"/>
           <w:sz w:val="21"/>
         </w:rPr>
-        <w:t>Fullstack Developer | Backend-Focused</w:t>
+        <w:t>Pengembang Fullstack | Fokus Backend</w:t>
       </w:r>
     </w:p>
     <w:p>
@@ -73,7 +73,7 @@
           <w:color w:val="111111"/>
           <w:sz w:val="18"/>
         </w:rPr>
-        <w:t>Backend-focused Fullstack Developer and Informatics Engineering student with a 3.77 GPA. Builds Laravel/PHP systems using MySQL, REST APIs, JWT authentication, and deployment, then connects them to React, Next.js, and Ionic interfaces.</w:t>
+        <w:t>Pengembang Fullstack dengan fokus backend dan mahasiswa Teknik Informatika ber-IPK 3.77. Mengembangkan sistem Laravel/PHP dengan MySQL, REST API, autentikasi JWT, dan deployment, lalu menghubungkannya ke antarmuka React, Next.js, serta Ionic.</w:t>
       </w:r>
     </w:p>
     <w:p>
@@ -90,7 +90,7 @@
           <w:color w:val="111111"/>
           <w:sz w:val="21"/>
         </w:rPr>
-        <w:t>EDUCATION</w:t>
+        <w:t>PENDIDIKAN</w:t>
       </w:r>
     </w:p>
     <w:p>
@@ -104,7 +104,7 @@
           <w:color w:val="111111"/>
           <w:sz w:val="18"/>
         </w:rPr>
-        <w:t>Universitas Buana Perjuangan Karawang | B.S. Informatics Engineering | 2024-Present | GPA: 3.77/4.00</w:t>
+        <w:t>Universitas Buana Perjuangan Karawang | S1 Teknik Informatika | 2024-Sekarang | IPK: 3.77/4.00</w:t>
       </w:r>
     </w:p>
     <w:p>
@@ -121,7 +121,7 @@
           <w:color w:val="111111"/>
           <w:sz w:val="21"/>
         </w:rPr>
-        <w:t>SELECTED PROJECTS</w:t>
+        <w:t>PROYEK PILIHAN</w:t>
       </w:r>
     </w:p>
     <w:p>
@@ -135,7 +135,7 @@
           <w:color w:val="111111"/>
           <w:sz w:val="18"/>
         </w:rPr>
-        <w:t>ZETA E-Procurement | Team Lead, Backend, Database, Authentication &amp; Deployment</w:t>
+        <w:t>ZETA E-Procurement | Ketua Tim, Backend, Database, Autentikasi &amp; Deployment</w:t>
       </w:r>
     </w:p>
     <w:p>
@@ -174,7 +174,7 @@
           <w:color w:val="111111"/>
           <w:sz w:val="17"/>
         </w:rPr>
-        <w:t>Led a five-person academic final project for integrated goods and services procurement.</w:t>
+        <w:t>Memimpin proyek akhir akademik dengan lima anggota tim untuk sistem pengadaan barang dan jasa terintegrasi.</w:t>
       </w:r>
     </w:p>
     <w:p>
@@ -198,7 +198,7 @@
           <w:color w:val="111111"/>
           <w:sz w:val="17"/>
         </w:rPr>
-        <w:t>Owned Laravel/PHP backend delivery, MySQL database design, JWT authentication, and deployment.</w:t>
+        <w:t>Mengembangkan backend Laravel/PHP, merancang basis data MySQL, menerapkan autentikasi JWT, dan menangani deployment.</w:t>
       </w:r>
     </w:p>
     <w:p>
@@ -222,7 +222,7 @@
           <w:color w:val="111111"/>
           <w:sz w:val="17"/>
         </w:rPr>
-        <w:t>Supported vendor, tender, bidding, digital contract, audit-log, document-export, and notification workflows.</w:t>
+        <w:t>Mengerjakan alur vendor, tender, bidding, kontrak digital, audit log, ekspor dokumen, dan notifikasi.</w:t>
       </w:r>
     </w:p>
     <w:p>
@@ -251,7 +251,7 @@
           <w:color w:val="111111"/>
           <w:sz w:val="18"/>
         </w:rPr>
-        <w:t>Coffee Karawang | Full-Stack Cafe Directory</w:t>
+        <w:t>Coffee Karawang | Direktori Kafe Full-Stack</w:t>
       </w:r>
     </w:p>
     <w:p>
@@ -266,7 +266,7 @@
           <w:color w:val="333333"/>
           <w:sz w:val="16"/>
         </w:rPr>
-        <w:t>Live: kopikarawang.vercel.app | GitHub: github.com/chandra7251/coffe_karawang</w:t>
+        <w:t>Web: kopikarawang.vercel.app | GitHub: github.com/chandra7251/coffe_karawang</w:t>
       </w:r>
     </w:p>
     <w:p>
@@ -290,7 +290,7 @@
           <w:color w:val="111111"/>
           <w:sz w:val="17"/>
         </w:rPr>
-        <w:t>Built a public directory for finding Karawang cafes and coffeeshops by category, facilities, and location.</w:t>
+        <w:t>Membangun direktori publik untuk mencari kafe dan coffeeshop Karawang berdasarkan kategori, fasilitas, dan lokasi.</w:t>
       </w:r>
     </w:p>
     <w:p>
@@ -314,7 +314,7 @@
           <w:color w:val="111111"/>
           <w:sz w:val="17"/>
         </w:rPr>
-        <w:t>Implemented authentication, reviews, bookmarks, filters, map integration, API routes, and an admin dashboard.</w:t>
+        <w:t>Menerapkan autentikasi, ulasan, bookmark, filter, integrasi peta, API routes, dan dashboard admin.</w:t>
       </w:r>
     </w:p>
     <w:p>
@@ -338,7 +338,7 @@
           <w:color w:val="111111"/>
           <w:sz w:val="17"/>
         </w:rPr>
-        <w:t>Connected Next.js and TypeScript interfaces to PostgreSQL through Prisma for data-driven features.</w:t>
+        <w:t>Menghubungkan antarmuka Next.js dan TypeScript ke PostgreSQL melalui Prisma untuk fitur berbasis data.</w:t>
       </w:r>
     </w:p>
     <w:p>
@@ -367,7 +367,7 @@
           <w:color w:val="111111"/>
           <w:sz w:val="18"/>
         </w:rPr>
-        <w:t>Cashier &amp; Owner | Point-of-Sale Web Application</w:t>
+        <w:t>Cashier &amp; Owner | Aplikasi POS Kafe</w:t>
       </w:r>
     </w:p>
     <w:p>
@@ -406,7 +406,7 @@
           <w:color w:val="111111"/>
           <w:sz w:val="17"/>
         </w:rPr>
-        <w:t>Developed a cafe POS application for cashier and owner roles using Laravel, React, and MySQL.</w:t>
+        <w:t>Mengembangkan aplikasi POS kafe untuk peran kasir dan owner menggunakan Laravel, React, dan MySQL.</w:t>
       </w:r>
     </w:p>
     <w:p>
@@ -430,7 +430,7 @@
           <w:color w:val="111111"/>
           <w:sz w:val="17"/>
         </w:rPr>
-        <w:t>Built transaction workflows, sales monitoring, and an operational dashboard for daily cafe activities.</w:t>
+        <w:t>Membangun alur transaksi, pemantauan penjualan, dan dashboard operasional untuk aktivitas kafe harian.</w:t>
       </w:r>
     </w:p>
     <w:p>
@@ -459,7 +459,7 @@
           <w:color w:val="111111"/>
           <w:sz w:val="18"/>
         </w:rPr>
-        <w:t>Hunter-Log | Mobile Fitness Tracker</w:t>
+        <w:t>Hunter-Log | Aplikasi Pelacak Kebugaran Mobile</w:t>
       </w:r>
     </w:p>
     <w:p>
@@ -498,7 +498,7 @@
           <w:color w:val="111111"/>
           <w:sz w:val="17"/>
         </w:rPr>
-        <w:t>Published a Solo Leveling-themed mobile gym tracker for logging workout progress and building exercise habits.</w:t>
+        <w:t>Mempublikasikan aplikasi pelacak gym bertema Solo Leveling untuk mencatat progres latihan dan membangun kebiasaan olahraga.</w:t>
       </w:r>
     </w:p>
     <w:p>
@@ -522,7 +522,7 @@
           <w:color w:val="111111"/>
           <w:sz w:val="17"/>
         </w:rPr>
-        <w:t>Developed the mobile application with Ionic and TypeScript, using SQLite for local workout data storage.</w:t>
+        <w:t>Mengembangkan aplikasi mobile dengan Ionic dan TypeScript serta memakai SQLite untuk penyimpanan data latihan lokal.</w:t>
       </w:r>
     </w:p>
     <w:p>
@@ -551,7 +551,7 @@
           <w:color w:val="111111"/>
           <w:sz w:val="18"/>
         </w:rPr>
-        <w:t>VisuaLearn | UX Design Project, GEMASTIK XIX 2026</w:t>
+        <w:t>VisuaLearn | Proyek Desain UX, GEMASTIK XIX 2026</w:t>
       </w:r>
     </w:p>
     <w:p>
@@ -566,7 +566,7 @@
           <w:color w:val="333333"/>
           <w:sz w:val="16"/>
         </w:rPr>
-        <w:t>Academic design competition project</w:t>
+        <w:t>Proyek kompetisi desain akademik</w:t>
       </w:r>
     </w:p>
     <w:p>
@@ -590,7 +590,7 @@
           <w:color w:val="111111"/>
           <w:sz w:val="17"/>
         </w:rPr>
-        <w:t>Led UX design for an accessible academic-information concept for Deaf students.</w:t>
+        <w:t>Memimpin desain UX untuk konsep informasi akademik yang aksesibel bagi mahasiswa Tuli.</w:t>
       </w:r>
     </w:p>
     <w:p>
@@ -614,7 +614,7 @@
           <w:color w:val="111111"/>
           <w:sz w:val="17"/>
         </w:rPr>
-        <w:t>Conducted exploratory research, user journeys, co-design, high-fidelity prototyping, and two usability-testing iterations.</w:t>
+        <w:t>Melakukan riset eksploratif, user journey, co-design, prototipe high-fidelity, dan dua iterasi usability testing.</w:t>
       </w:r>
     </w:p>
     <w:p>
@@ -646,7 +646,7 @@
           <w:color w:val="111111"/>
           <w:sz w:val="21"/>
         </w:rPr>
-        <w:t>TECHNICAL SKILLS</w:t>
+        <w:t>KEAHLIAN TEKNIS</w:t>
       </w:r>
     </w:p>
     <w:p>
@@ -660,7 +660,7 @@
           <w:color w:val="111111"/>
           <w:sz w:val="17"/>
         </w:rPr>
-        <w:t xml:space="preserve">Backend &amp; Data: </w:t>
+        <w:t xml:space="preserve">Backend &amp; Basis Data: </w:t>
       </w:r>
       <w:r>
         <w:rPr>
@@ -669,7 +669,7 @@
           <w:color w:val="111111"/>
           <w:sz w:val="17"/>
         </w:rPr>
-        <w:t>Laravel, PHP, MySQL, PostgreSQL, REST API, JWT Authentication, Prisma, Filament</w:t>
+        <w:t>Laravel, PHP, MySQL, PostgreSQL, REST API, Autentikasi JWT, Prisma, Filament</w:t>
       </w:r>
     </w:p>
     <w:p>
@@ -692,7 +692,7 @@
           <w:color w:val="111111"/>
           <w:sz w:val="17"/>
         </w:rPr>
-        <w:t>React, Next.js, JavaScript, TypeScript, Ionic, Blade, Tailwind CSS</w:t>
+        <w:t>React, Next.js, JavaScript, TypeScript, Ionic, Blade, Tailwind CSS, SQLite</w:t>
       </w:r>
     </w:p>
     <w:p>
@@ -715,7 +715,7 @@
           <w:color w:val="111111"/>
           <w:sz w:val="17"/>
         </w:rPr>
-        <w:t>Node.js, Git, GitHub, Vercel</w:t>
+        <w:t>Git, GitHub, Vercel</w:t>
       </w:r>
     </w:p>
     <w:p>
@@ -732,7 +732,7 @@
           <w:color w:val="111111"/>
           <w:sz w:val="21"/>
         </w:rPr>
-        <w:t>PROFESSIONAL EXPERIENCE</w:t>
+        <w:t>PENGALAMAN KERJA</w:t>
       </w:r>
     </w:p>
     <w:p>
@@ -746,7 +746,7 @@
           <w:color w:val="111111"/>
           <w:sz w:val="18"/>
         </w:rPr>
-        <w:t>PT AT Indonesia | Production Operator | June 2023-June 2024</w:t>
+        <w:t>PT AT Indonesia | Operator Produksi | Juni 2023-Juni 2024</w:t>
       </w:r>
     </w:p>
     <w:p>
@@ -770,21 +770,7 @@
           <w:color w:val="111111"/>
           <w:sz w:val="17"/>
         </w:rPr>
-        <w:t>Operated machining processes under SOPs, safety requirements, and quality standards while collaborating to meet daily production targets.</w:t>
-      </w:r>
-    </w:p>
-    <w:p>
-      <w:pPr>
-        <w:spacing w:before="20" w:after="2" w:line="240" w:lineRule="auto"/>
-      </w:pPr>
-      <w:r>
-        <w:rPr>
-          <w:rFonts w:ascii="Arial" w:hAnsi="Arial" w:eastAsia="Arial"/>
-          <w:b/>
-          <w:color w:val="111111"/>
-          <w:sz w:val="18"/>
-        </w:rPr>
-        <w:t>PT Marutake Miyama Indonesia | Quality Inspection Intern (PKL) | November 2021-January 2022</w:t>
+        <w:t>Mengoperasikan proses machining sesuai SOP, persyaratan keselamatan kerja, dan standar kualitas perusahaan.</w:t>
       </w:r>
     </w:p>
     <w:p>
@@ -808,7 +794,69 @@
           <w:color w:val="111111"/>
           <w:sz w:val="17"/>
         </w:rPr>
-        <w:t>Inspected products against quality standards, identified nonconforming units for repair, and completed packing for accepted products.</w:t>
+        <w:t>Berkolaborasi dengan tim produksi untuk menjaga kualitas serta memenuhi target produksi harian.</w:t>
+      </w:r>
+    </w:p>
+    <w:p>
+      <w:pPr>
+        <w:spacing w:before="20" w:after="2" w:line="240" w:lineRule="auto"/>
+      </w:pPr>
+      <w:r>
+        <w:rPr>
+          <w:rFonts w:ascii="Arial" w:hAnsi="Arial" w:eastAsia="Arial"/>
+          <w:b/>
+          <w:color w:val="111111"/>
+          <w:sz w:val="18"/>
+        </w:rPr>
+        <w:t>PT Marutake Miyama Indonesia | Magang Quality Inspection (PKL) | November 2021-Januari 2022</w:t>
+      </w:r>
+    </w:p>
+    <w:p>
+      <w:pPr>
+        <w:spacing w:before="0" w:after="2" w:line="245" w:lineRule="auto"/>
+        <w:ind w:left="144"/>
+      </w:pPr>
+      <w:r>
+        <w:rPr>
+          <w:rFonts w:ascii="Arial" w:hAnsi="Arial" w:eastAsia="Arial"/>
+          <w:b/>
+          <w:color w:val="111111"/>
+          <w:sz w:val="17"/>
+        </w:rPr>
+        <w:t xml:space="preserve">- </w:t>
+      </w:r>
+      <w:r>
+        <w:rPr>
+          <w:rFonts w:ascii="Arial" w:hAnsi="Arial" w:eastAsia="Arial"/>
+          <w:b w:val="0"/>
+          <w:color w:val="111111"/>
+          <w:sz w:val="17"/>
+        </w:rPr>
+        <w:t>Memeriksa produk berdasarkan standar kualitas dan mengidentifikasi produk NG untuk proses perbaikan.</w:t>
+      </w:r>
+    </w:p>
+    <w:p>
+      <w:pPr>
+        <w:spacing w:before="0" w:after="2" w:line="245" w:lineRule="auto"/>
+        <w:ind w:left="144"/>
+      </w:pPr>
+      <w:r>
+        <w:rPr>
+          <w:rFonts w:ascii="Arial" w:hAnsi="Arial" w:eastAsia="Arial"/>
+          <w:b/>
+          <w:color w:val="111111"/>
+          <w:sz w:val="17"/>
+        </w:rPr>
+        <w:t xml:space="preserve">- </w:t>
+      </w:r>
+      <w:r>
+        <w:rPr>
+          <w:rFonts w:ascii="Arial" w:hAnsi="Arial" w:eastAsia="Arial"/>
+          <w:b w:val="0"/>
+          <w:color w:val="111111"/>
+          <w:sz w:val="17"/>
+        </w:rPr>
+        <w:t>Melakukan packing untuk produk yang lolos inspeksi sebelum dikirim kepada pelanggan.</w:t>
       </w:r>
     </w:p>
     <w:sectPr>

</xml_diff>